<commit_message>
docs(adr-004): reconcile to v2.4; add CAP-022 seed-matrix & CAP-024 reactive-discovery normative blocks
</commit_message>
<xml_diff>
--- a/docs/adr/acrme_adr_004_forecast_and_increase_of_capacity_and_quota.docx
+++ b/docs/adr/acrme_adr_004_forecast_and_increase_of_capacity_and_quota.docx
@@ -33,7 +33,7 @@
         <w:t xml:space="preserve"> </w:t>
       </w:r>
       <w:r>
-        <w:t xml:space="preserve">Principal Cloud Architect — Architecture Governance</w:t>
+        <w:t xml:space="preserve">Principal Cloud Architect - Architecture Governance</w:t>
       </w:r>
       <w:r>
         <w:br/>
@@ -49,7 +49,7 @@
         <w:t xml:space="preserve"> </w:t>
       </w:r>
       <w:r>
-        <w:t xml:space="preserve">1.2</w:t>
+        <w:t xml:space="preserve">2.4</w:t>
       </w:r>
       <w:r>
         <w:br/>
@@ -65,7 +65,7 @@
         <w:t xml:space="preserve"> </w:t>
       </w:r>
       <w:r>
-        <w:t xml:space="preserve">August 2026</w:t>
+        <w:t xml:space="preserve">7 September 2026</w:t>
       </w:r>
       <w:r>
         <w:br/>
@@ -81,7 +81,7 @@
         <w:t xml:space="preserve"> </w:t>
       </w:r>
       <w:r>
-        <w:t xml:space="preserve">Accepted</w:t>
+        <w:t xml:space="preserve">Accepted - supersedes ADR-004 v1.2 forecast-only sizing content; reconciled to Baseline v2.4 (seed matrix + reactive discovery)</w:t>
       </w:r>
       <w:r>
         <w:br/>
@@ -97,7 +97,7 @@
         <w:t xml:space="preserve"> </w:t>
       </w:r>
       <w:r>
-        <w:t xml:space="preserve">ACRME Architecture Decision Records — one of four standalone, self-contained records.</w:t>
+        <w:t xml:space="preserve">ACRME Architecture Decision Records - aligned to Capacity &amp; Quota Management Requirements Baseline v2.4.</w:t>
       </w:r>
     </w:p>
     <w:p>
@@ -115,7 +115,59 @@
         <w:t xml:space="preserve"> </w:t>
       </w:r>
       <w:r>
-        <w:t xml:space="preserve">An Architecture Decision Record captures a single significant architectural decision, the context that forced it, the options considered, the choice made, and its consequences. ADRs are immutable once accepted — a superseding decision is recorded as a new ADR rather than editing the original. This record is self-contained: it can be read without any companion document. Evidence tags:</w:t>
+        <w:t xml:space="preserve">An Architecture Decision Record captures a significant architectural decision, the context that forced it, the options considered, the choice made, and its consequences. This ADR separates continuous reconciliation from longer-horizon forecasting and quota/capacity increase workflows. The</w:t>
+      </w:r>
+      <w:r>
+        <w:t xml:space="preserve"> </w:t>
+      </w:r>
+      <w:r>
+        <w:rPr>
+          <w:bCs/>
+          <w:b/>
+        </w:rPr>
+        <w:t xml:space="preserve">v2.4 revision</w:t>
+      </w:r>
+      <w:r>
+        <w:t xml:space="preserve"> </w:t>
+      </w:r>
+      <w:r>
+        <w:t xml:space="preserve">adds the seed-matrix initialisation model (</w:t>
+      </w:r>
+      <w:r>
+        <w:rPr>
+          <w:bCs/>
+          <w:b/>
+        </w:rPr>
+        <w:t xml:space="preserve">CAP-022</w:t>
+      </w:r>
+      <w:r>
+        <w:t xml:space="preserve">) and the reactive SKU/AZ discovery workflow (</w:t>
+      </w:r>
+      <w:r>
+        <w:rPr>
+          <w:bCs/>
+          <w:b/>
+        </w:rPr>
+        <w:t xml:space="preserve">CAP-024</w:t>
+      </w:r>
+      <w:r>
+        <w:t xml:space="preserve">) — see</w:t>
+      </w:r>
+      <w:r>
+        <w:t xml:space="preserve"> </w:t>
+      </w:r>
+      <w:r>
+        <w:rPr>
+          <w:iCs/>
+          <w:i/>
+        </w:rPr>
+        <w:t xml:space="preserve">Seed Matrix Initialisation and Reactive Discovery</w:t>
+      </w:r>
+      <w:r>
+        <w:t xml:space="preserve"> </w:t>
+      </w:r>
+      <w:r>
+        <w:t xml:space="preserve">below. Evidence tags:</w:t>
       </w:r>
       <w:r>
         <w:t xml:space="preserve"> </w:t>
@@ -163,10 +215,7 @@
         <w:t xml:space="preserve">[Assumed]</w:t>
       </w:r>
       <w:r>
-        <w:t xml:space="preserve"> </w:t>
-      </w:r>
-      <w:r>
-        <w:t xml:space="preserve">(see Appendix).</w:t>
+        <w:t xml:space="preserve">.</w:t>
       </w:r>
     </w:p>
     <w:p>
@@ -176,13 +225,13 @@
         </w:pict>
       </w:r>
     </w:p>
-    <w:bookmarkStart w:id="34" w:name="X26bb2dd1e6ed50cfaa8bfd7d8d9521ec21700a3"/>
+    <w:bookmarkStart w:id="37" w:name="X5f87161e1cda1b32b99ad020cba83209ea6026b"/>
     <w:p>
       <w:pPr>
         <w:pStyle w:val="Heading1"/>
       </w:pPr>
       <w:r>
-        <w:t xml:space="preserve">ADR-004 — Forecast and Increase of Capacity and Quota</w:t>
+        <w:t xml:space="preserve">ADR-004 - Forecast, Reconciliation, and Increase of Capacity and Quota</w:t>
       </w:r>
     </w:p>
     <w:p>
@@ -216,7 +265,7 @@
         <w:t xml:space="preserve"> </w:t>
       </w:r>
       <w:r>
-        <w:t xml:space="preserve">August 2026</w:t>
+        <w:t xml:space="preserve">27 August 2026</w:t>
       </w:r>
       <w:r>
         <w:br/>
@@ -232,7 +281,7 @@
         <w:t xml:space="preserve"> </w:t>
       </w:r>
       <w:r>
-        <w:t xml:space="preserve">Principal Cloud Architect, Platform Engineering, FinOps, Capacity Planning</w:t>
+        <w:t xml:space="preserve">Principal Cloud Architect, Platform Engineering, FinOps, Capacity Planning, Operations</w:t>
       </w:r>
       <w:r>
         <w:br/>
@@ -242,19 +291,48 @@
           <w:bCs/>
           <w:b/>
         </w:rPr>
-        <w:t xml:space="preserve">Related constraints:</w:t>
-      </w:r>
-      <w:r>
-        <w:t xml:space="preserve"> </w:t>
-      </w:r>
-      <w:r>
-        <w:t xml:space="preserve">HC-3 (applied at increase-execution time)</w:t>
+        <w:t xml:space="preserve">Related requirements:</w:t>
+      </w:r>
+      <w:r>
+        <w:t xml:space="preserve"> </w:t>
+      </w:r>
+      <w:r>
+        <w:t xml:space="preserve">CAP-003..CAP-010,</w:t>
+      </w:r>
+      <w:r>
+        <w:t xml:space="preserve"> </w:t>
+      </w:r>
+      <w:r>
+        <w:rPr>
+          <w:bCs/>
+          <w:b/>
+        </w:rPr>
+        <w:t xml:space="preserve">CAP-019, CAP-020..CAP-024</w:t>
+      </w:r>
+      <w:r>
+        <w:t xml:space="preserve">, QUA-006..QUA-010, RDY-001..RDY-004, FIN-001..FIN-006, OBS-001..OBS-005, NFR-003..NFR-010, OPS-001..OPS-006</w:t>
+      </w:r>
+      <w:r>
+        <w:br/>
+      </w:r>
+      <w:r>
+        <w:rPr>
+          <w:bCs/>
+          <w:b/>
+        </w:rPr>
+        <w:t xml:space="preserve">Related POCs:</w:t>
+      </w:r>
+      <w:r>
+        <w:t xml:space="preserve"> </w:t>
+      </w:r>
+      <w:r>
+        <w:t xml:space="preserve">POC-004, POC-005, POC-008, POC-009, POC-010</w:t>
       </w:r>
     </w:p>
     <w:bookmarkStart w:id="20" w:name="context"/>
     <w:p>
       <w:pPr>
-        <w:pStyle w:val="Heading3"/>
+        <w:pStyle w:val="Heading2"/>
       </w:pPr>
       <w:r>
         <w:t xml:space="preserve">Context</w:t>
@@ -265,69 +343,7 @@
         <w:pStyle w:val="FirstParagraph"/>
       </w:pPr>
       <w:r>
-        <w:t xml:space="preserve">Reserved capacity must grow ahead of demand — but Azure quota increases take time to approve, and over-reservation wastes money. The engine needs to forecast demand, recommend right-sized capacity, and drive quota/CR increases with enough lead time,</w:t>
-      </w:r>
-      <w:r>
-        <w:t xml:space="preserve"> </w:t>
-      </w:r>
-      <w:r>
-        <w:rPr>
-          <w:bCs/>
-          <w:b/>
-        </w:rPr>
-        <w:t xml:space="preserve">without</w:t>
-      </w:r>
-      <w:r>
-        <w:t xml:space="preserve"> </w:t>
-      </w:r>
-      <w:r>
-        <w:t xml:space="preserve">ever autonomously performing material or destructive changes in Phase 1. This growth path must be architecturally distinct from crisis operations (see ADR-003).</w:t>
-      </w:r>
-    </w:p>
-    <w:bookmarkEnd w:id="20"/>
-    <w:bookmarkStart w:id="27" w:name="decision"/>
-    <w:p>
-      <w:pPr>
-        <w:pStyle w:val="Heading3"/>
-      </w:pPr>
-      <w:r>
-        <w:t xml:space="preserve">Decision</w:t>
-      </w:r>
-    </w:p>
-    <w:p>
-      <w:pPr>
-        <w:pStyle w:val="FirstParagraph"/>
-      </w:pPr>
-      <w:r>
-        <w:t xml:space="preserve">Adopt</w:t>
-      </w:r>
-      <w:r>
-        <w:t xml:space="preserve"> </w:t>
-      </w:r>
-      <w:r>
-        <w:rPr>
-          <w:bCs/>
-          <w:b/>
-        </w:rPr>
-        <w:t xml:space="preserve">forecast-driven, approval-gated capacity growth</w:t>
-      </w:r>
-      <w:r>
-        <w:t xml:space="preserve"> </w:t>
-      </w:r>
-      <w:r>
-        <w:t xml:space="preserve">operating exclusively in</w:t>
-      </w:r>
-      <w:r>
-        <w:t xml:space="preserve"> </w:t>
-      </w:r>
-      <w:r>
-        <w:rPr>
-          <w:rStyle w:val="VerbatimChar"/>
-        </w:rPr>
-        <w:t xml:space="preserve">STEADY_STATE</w:t>
-      </w:r>
-      <w:r>
-        <w:t xml:space="preserve">:</w:t>
+        <w:t xml:space="preserve">The earlier ADR treated forecast demand as the primary capacity sizing formula. Requirements v2.1 splits this into two distinct control loops:</w:t>
       </w:r>
     </w:p>
     <w:p>
@@ -336,28 +352,20 @@
           <w:ilvl w:val="0"/>
           <w:numId w:val="1001"/>
         </w:numPr>
-      </w:pPr>
-      <w:r>
-        <w:rPr>
-          <w:bCs/>
-          <w:b/>
-        </w:rPr>
-        <w:t xml:space="preserve">Forecasting</w:t>
-      </w:r>
-      <w:r>
-        <w:t xml:space="preserve"> </w:t>
-      </w:r>
-      <w:r>
-        <w:t xml:space="preserve">analyses historical CR allocation and projects demand over a configurable window (default 30/60/90 days), exposing raw time series and derived recommendations via API.</w:t>
-      </w:r>
-      <w:r>
-        <w:t xml:space="preserve"> </w:t>
-      </w:r>
-      <w:r>
-        <w:rPr>
-          <w:rStyle w:val="VerbatimChar"/>
-        </w:rPr>
-        <w:t xml:space="preserve">[Documented]</w:t>
+        <w:pStyle w:val="Compact"/>
+      </w:pPr>
+      <w:r>
+        <w:rPr>
+          <w:bCs/>
+          <w:b/>
+        </w:rPr>
+        <w:t xml:space="preserve">Continuous reconciliation</w:t>
+      </w:r>
+      <w:r>
+        <w:t xml:space="preserve"> </w:t>
+      </w:r>
+      <w:r>
+        <w:t xml:space="preserve">keeps current reservations aligned to actual allocated demand plus a configurable buffer.</w:t>
       </w:r>
     </w:p>
     <w:p>
@@ -366,22 +374,98 @@
           <w:ilvl w:val="0"/>
           <w:numId w:val="1001"/>
         </w:numPr>
-      </w:pPr>
-      <w:r>
-        <w:rPr>
-          <w:bCs/>
-          <w:b/>
-        </w:rPr>
-        <w:t xml:space="preserve">Capacity sizing formula:</w:t>
-      </w:r>
-      <w:r>
-        <w:t xml:space="preserve"> </w:t>
-      </w:r>
-      <w:r>
-        <w:rPr>
-          <w:rStyle w:val="VerbatimChar"/>
-        </w:rPr>
-        <w:t xml:space="preserve">[Documented]</w:t>
+        <w:pStyle w:val="Compact"/>
+      </w:pPr>
+      <w:r>
+        <w:rPr>
+          <w:bCs/>
+          <w:b/>
+        </w:rPr>
+        <w:t xml:space="preserve">Forecast and increase planning</w:t>
+      </w:r>
+      <w:r>
+        <w:t xml:space="preserve"> </w:t>
+      </w:r>
+      <w:r>
+        <w:t xml:space="preserve">predicts future demand, quota needs, and cost exposure, then drives approval-gated quota/capacity changes.</w:t>
+      </w:r>
+      <w:r>
+        <w:t xml:space="preserve"> </w:t>
+      </w:r>
+      <w:r>
+        <w:rPr>
+          <w:rStyle w:val="VerbatimChar"/>
+        </w:rPr>
+        <w:t xml:space="preserve">[Decided]</w:t>
+      </w:r>
+    </w:p>
+    <w:p>
+      <w:pPr>
+        <w:pStyle w:val="FirstParagraph"/>
+      </w:pPr>
+      <w:r>
+        <w:t xml:space="preserve">This distinction matters because associated-but-deallocated VMs should not automatically preserve expensive reservations, while production growth still needs proactive planning and alerting.</w:t>
+      </w:r>
+      <w:r>
+        <w:t xml:space="preserve"> </w:t>
+      </w:r>
+      <w:r>
+        <w:rPr>
+          <w:rStyle w:val="VerbatimChar"/>
+        </w:rPr>
+        <w:t xml:space="preserve">[Derived]</w:t>
+      </w:r>
+    </w:p>
+    <w:bookmarkEnd w:id="20"/>
+    <w:bookmarkStart w:id="21" w:name="decision"/>
+    <w:p>
+      <w:pPr>
+        <w:pStyle w:val="Heading2"/>
+      </w:pPr>
+      <w:r>
+        <w:t xml:space="preserve">Decision</w:t>
+      </w:r>
+    </w:p>
+    <w:p>
+      <w:pPr>
+        <w:pStyle w:val="FirstParagraph"/>
+      </w:pPr>
+      <w:r>
+        <w:t xml:space="preserve">Adopt a</w:t>
+      </w:r>
+      <w:r>
+        <w:t xml:space="preserve"> </w:t>
+      </w:r>
+      <w:r>
+        <w:rPr>
+          <w:bCs/>
+          <w:b/>
+        </w:rPr>
+        <w:t xml:space="preserve">two-path capacity management model</w:t>
+      </w:r>
+      <w:r>
+        <w:t xml:space="preserve">:</w:t>
+      </w:r>
+    </w:p>
+    <w:p>
+      <w:pPr>
+        <w:numPr>
+          <w:ilvl w:val="0"/>
+          <w:numId w:val="1002"/>
+        </w:numPr>
+      </w:pPr>
+      <w:r>
+        <w:rPr>
+          <w:bCs/>
+          <w:b/>
+        </w:rPr>
+        <w:t xml:space="preserve">Reconciliation floor is allocated demand plus buffer.</w:t>
+      </w:r>
+      <w:r>
+        <w:t xml:space="preserve"> </w:t>
+      </w:r>
+      <w:r>
+        <w:t xml:space="preserve">The normative steady-state floor is:</w:t>
       </w:r>
     </w:p>
     <w:p>
@@ -396,7 +480,7 @@
         <w:rPr>
           <w:rStyle w:val="VerbatimChar"/>
         </w:rPr>
-        <w:t xml:space="preserve">Forecast_Quantity = ceil(Forecast_Peak × (1 + Growth_Buffer) + DR_Buffer)</w:t>
+        <w:t xml:space="preserve">Target Reserved Capacity = Allocated VM Count + Configured Buffer</w:t>
       </w:r>
     </w:p>
     <w:p>
@@ -407,346 +491,10 @@
         </w:numPr>
       </w:pPr>
       <w:r>
-        <w:t xml:space="preserve">Increase when forecast demand exceeds current reserved quantity within the window; right-size down when demand is consistently below current, honouring a configurable buffer.</w:t>
-      </w:r>
-    </w:p>
-    <w:p>
-      <w:pPr>
-        <w:numPr>
-          <w:ilvl w:val="0"/>
-          <w:numId w:val="1001"/>
-        </w:numPr>
-      </w:pPr>
-      <w:r>
-        <w:rPr>
-          <w:bCs/>
-          <w:b/>
-        </w:rPr>
-        <w:t xml:space="preserve">Lead-time alerting:</w:t>
-      </w:r>
-      <w:r>
-        <w:t xml:space="preserve"> </w:t>
-      </w:r>
-      <w:r>
-        <w:t xml:space="preserve">when forecast demand approaches a quota limit (default</w:t>
-      </w:r>
-      <w:r>
-        <w:t xml:space="preserve"> </w:t>
-      </w:r>
-      <w:r>
-        <w:rPr>
-          <w:bCs/>
-          <w:b/>
-        </w:rPr>
-        <w:t xml:space="preserve">80%</w:t>
-      </w:r>
-      <w:r>
-        <w:t xml:space="preserve">), emit</w:t>
-      </w:r>
-      <w:r>
-        <w:t xml:space="preserve"> </w:t>
-      </w:r>
-      <w:r>
-        <w:rPr>
-          <w:rStyle w:val="VerbatimChar"/>
-        </w:rPr>
-        <w:t xml:space="preserve">ForecastApproachingQuotaLimit</w:t>
-      </w:r>
-      <w:r>
-        <w:t xml:space="preserve"> </w:t>
-      </w:r>
-      <w:r>
-        <w:t xml:space="preserve">with a</w:t>
-      </w:r>
-      <w:r>
-        <w:t xml:space="preserve"> </w:t>
-      </w:r>
-      <w:r>
-        <w:rPr>
-          <w:bCs/>
-          <w:b/>
-        </w:rPr>
-        <w:t xml:space="preserve">14-day lead time</w:t>
-      </w:r>
-      <w:r>
-        <w:t xml:space="preserve"> </w:t>
-      </w:r>
-      <w:r>
-        <w:t xml:space="preserve">— enough for quota-increase processing.</w:t>
-      </w:r>
-      <w:r>
-        <w:t xml:space="preserve"> </w:t>
-      </w:r>
-      <w:r>
-        <w:rPr>
-          <w:rStyle w:val="VerbatimChar"/>
-        </w:rPr>
-        <w:t xml:space="preserve">[Documented]</w:t>
-      </w:r>
-    </w:p>
-    <w:p>
-      <w:pPr>
-        <w:numPr>
-          <w:ilvl w:val="0"/>
-          <w:numId w:val="1001"/>
-        </w:numPr>
-      </w:pPr>
-      <w:r>
-        <w:rPr>
-          <w:bCs/>
-          <w:b/>
-        </w:rPr>
-        <w:t xml:space="preserve">Auto-increase is approval-gated in Phase 1.</w:t>
-      </w:r>
-      <w:r>
-        <w:t xml:space="preserve"> </w:t>
-      </w:r>
-      <w:r>
-        <w:t xml:space="preserve">The trigger uses utilisation thresholds with</w:t>
-      </w:r>
-      <w:r>
-        <w:t xml:space="preserve"> </w:t>
-      </w:r>
-      <w:r>
-        <w:rPr>
-          <w:bCs/>
-          <w:b/>
-        </w:rPr>
-        <w:t xml:space="preserve">debounce/cooldown</w:t>
-      </w:r>
-      <w:r>
-        <w:t xml:space="preserve"> </w:t>
-      </w:r>
-      <w:r>
-        <w:t xml:space="preserve">to avoid thrashing; a</w:t>
-      </w:r>
-      <w:r>
-        <w:t xml:space="preserve"> </w:t>
-      </w:r>
-      <w:r>
-        <w:rPr>
-          <w:rStyle w:val="VerbatimChar"/>
-        </w:rPr>
-        <w:t xml:space="preserve">CapacityIncreaseRequest</w:t>
-      </w:r>
-      <w:r>
-        <w:t xml:space="preserve"> </w:t>
-      </w:r>
-      <w:r>
-        <w:t xml:space="preserve">entity carries the full lifecycle (create → approve → execute → retry → cancel), and Phase 1 requires</w:t>
-      </w:r>
-      <w:r>
-        <w:t xml:space="preserve"> </w:t>
-      </w:r>
-      <w:r>
-        <w:rPr>
-          <w:bCs/>
-          <w:b/>
-        </w:rPr>
-        <w:t xml:space="preserve">operator approval</w:t>
-      </w:r>
-      <w:r>
-        <w:t xml:space="preserve"> </w:t>
-      </w:r>
-      <w:r>
-        <w:t xml:space="preserve">before execution.</w:t>
-      </w:r>
-      <w:r>
-        <w:t xml:space="preserve"> </w:t>
-      </w:r>
-      <w:r>
         <w:rPr>
           <w:rStyle w:val="VerbatimChar"/>
         </w:rPr>
         <w:t xml:space="preserve">[Decided]</w:t>
-      </w:r>
-    </w:p>
-    <w:p>
-      <w:pPr>
-        <w:numPr>
-          <w:ilvl w:val="0"/>
-          <w:numId w:val="1001"/>
-        </w:numPr>
-      </w:pPr>
-      <w:r>
-        <w:rPr>
-          <w:bCs/>
-          <w:b/>
-        </w:rPr>
-        <w:t xml:space="preserve">Quota increases</w:t>
-      </w:r>
-      <w:r>
-        <w:t xml:space="preserve"> </w:t>
-      </w:r>
-      <w:r>
-        <w:t xml:space="preserve">are initiated via the Azure Support REST API (</w:t>
-      </w:r>
-      <w:r>
-        <w:rPr>
-          <w:rStyle w:val="VerbatimChar"/>
-        </w:rPr>
-        <w:t xml:space="preserve">Microsoft.Capacity/.../serviceLimits</w:t>
-      </w:r>
-      <w:r>
-        <w:t xml:space="preserve">) — at group level where Quota Groups apply (see ADR-002) — subject to the same operator-approval gate.</w:t>
-      </w:r>
-      <w:r>
-        <w:t xml:space="preserve"> </w:t>
-      </w:r>
-      <w:r>
-        <w:rPr>
-          <w:rStyle w:val="VerbatimChar"/>
-        </w:rPr>
-        <w:t xml:space="preserve">[Documented]</w:t>
-      </w:r>
-    </w:p>
-    <w:p>
-      <w:pPr>
-        <w:numPr>
-          <w:ilvl w:val="0"/>
-          <w:numId w:val="1001"/>
-        </w:numPr>
-      </w:pPr>
-      <w:r>
-        <w:rPr>
-          <w:bCs/>
-          <w:b/>
-        </w:rPr>
-        <w:t xml:space="preserve">Mode isolation.</w:t>
-      </w:r>
-      <w:r>
-        <w:t xml:space="preserve"> </w:t>
-      </w:r>
-      <w:r>
-        <w:t xml:space="preserve">Auto-increase runs</w:t>
-      </w:r>
-      <w:r>
-        <w:t xml:space="preserve"> </w:t>
-      </w:r>
-      <w:r>
-        <w:rPr>
-          <w:bCs/>
-          <w:b/>
-        </w:rPr>
-        <w:t xml:space="preserve">only</w:t>
-      </w:r>
-      <w:r>
-        <w:t xml:space="preserve"> </w:t>
-      </w:r>
-      <w:r>
-        <w:t xml:space="preserve">in</w:t>
-      </w:r>
-      <w:r>
-        <w:t xml:space="preserve"> </w:t>
-      </w:r>
-      <w:r>
-        <w:rPr>
-          <w:rStyle w:val="VerbatimChar"/>
-        </w:rPr>
-        <w:t xml:space="preserve">STEADY_STATE</w:t>
-      </w:r>
-      <w:r>
-        <w:t xml:space="preserve"> </w:t>
-      </w:r>
-      <w:r>
-        <w:t xml:space="preserve">and is</w:t>
-      </w:r>
-      <w:r>
-        <w:t xml:space="preserve"> </w:t>
-      </w:r>
-      <w:r>
-        <w:rPr>
-          <w:bCs/>
-          <w:b/>
-        </w:rPr>
-        <w:t xml:space="preserve">suppressed during</w:t>
-      </w:r>
-      <w:r>
-        <w:rPr>
-          <w:bCs/>
-          <w:b/>
-        </w:rPr>
-        <w:t xml:space="preserve"> </w:t>
-      </w:r>
-      <w:r>
-        <w:rPr>
-          <w:rStyle w:val="VerbatimChar"/>
-          <w:bCs/>
-          <w:b/>
-        </w:rPr>
-        <w:t xml:space="preserve">DR_EVENT_ACTIVE</w:t>
-      </w:r>
-      <w:r>
-        <w:t xml:space="preserve">, keeping organic growth strictly separate from crisis transfer (see ADR-003).</w:t>
-      </w:r>
-      <w:r>
-        <w:t xml:space="preserve"> </w:t>
-      </w:r>
-      <w:r>
-        <w:rPr>
-          <w:rStyle w:val="VerbatimChar"/>
-        </w:rPr>
-        <w:t xml:space="preserve">[Decided]</w:t>
-      </w:r>
-    </w:p>
-    <w:p>
-      <w:pPr>
-        <w:numPr>
-          <w:ilvl w:val="0"/>
-          <w:numId w:val="1001"/>
-        </w:numPr>
-      </w:pPr>
-      <w:r>
-        <w:rPr>
-          <w:bCs/>
-          <w:b/>
-        </w:rPr>
-        <w:t xml:space="preserve">Non-destructive guarantee.</w:t>
-      </w:r>
-      <w:r>
-        <w:t xml:space="preserve"> </w:t>
-      </w:r>
-      <w:r>
-        <w:t xml:space="preserve">Increases only ever raise CR quantity or request more quota; guarded reduction (right-sizing) never drops a CR below its allocated count (the platform floor) and is itself approval-gated.</w:t>
-      </w:r>
-    </w:p>
-    <w:bookmarkStart w:id="24" w:name="Xf1426b79a09c525d9ee2bfb22640520d79a16bd"/>
-    <w:p>
-      <w:pPr>
-        <w:pStyle w:val="Heading4"/>
-      </w:pPr>
-      <w:r>
-        <w:t xml:space="preserve">Steady-State Capacity Lifecycle (normative 10-step policy)</w:t>
-      </w:r>
-    </w:p>
-    <w:p>
-      <w:pPr>
-        <w:pStyle w:val="FirstParagraph"/>
-      </w:pPr>
-      <w:r>
-        <w:t xml:space="preserve">The steady-state increase runs strictly separate from DR crisis operations and follows a fixed sequence, with</w:t>
-      </w:r>
-      <w:r>
-        <w:t xml:space="preserve"> </w:t>
-      </w:r>
-      <w:r>
-        <w:rPr>
-          <w:bCs/>
-          <w:b/>
-        </w:rPr>
-        <w:t xml:space="preserve">no assumed quota-propagation SLA</w:t>
-      </w:r>
-      <w:r>
-        <w:t xml:space="preserve">:</w:t>
-      </w:r>
-      <w:r>
-        <w:t xml:space="preserve"> </w:t>
-      </w:r>
-      <w:r>
-        <w:rPr>
-          <w:rStyle w:val="VerbatimChar"/>
-        </w:rPr>
-        <w:t xml:space="preserve">[Documented]</w:t>
       </w:r>
     </w:p>
     <w:p>
@@ -755,10 +503,28 @@
           <w:ilvl w:val="0"/>
           <w:numId w:val="1002"/>
         </w:numPr>
-        <w:pStyle w:val="Compact"/>
-      </w:pPr>
-      <w:r>
-        <w:t xml:space="preserve">Detect threshold crossing.</w:t>
+      </w:pPr>
+      <w:r>
+        <w:rPr>
+          <w:bCs/>
+          <w:b/>
+        </w:rPr>
+        <w:t xml:space="preserve">Forecasting is advisory and proactive.</w:t>
+      </w:r>
+      <w:r>
+        <w:t xml:space="preserve"> </w:t>
+      </w:r>
+      <w:r>
+        <w:t xml:space="preserve">Forecasting estimates future peaks and produces recommendations, quota lead-time alerts, and increase requests; it does not override the reconciliation floor without policy approval.</w:t>
+      </w:r>
+      <w:r>
+        <w:t xml:space="preserve"> </w:t>
+      </w:r>
+      <w:r>
+        <w:rPr>
+          <w:rStyle w:val="VerbatimChar"/>
+        </w:rPr>
+        <w:t xml:space="preserve">[Decided]</w:t>
       </w:r>
     </w:p>
     <w:p>
@@ -767,10 +533,28 @@
           <w:ilvl w:val="0"/>
           <w:numId w:val="1002"/>
         </w:numPr>
-        <w:pStyle w:val="Compact"/>
-      </w:pPr>
-      <w:r>
-        <w:t xml:space="preserve">Re-read current CR, quota, sharing, and assignment state.</w:t>
+      </w:pPr>
+      <w:r>
+        <w:rPr>
+          <w:bCs/>
+          <w:b/>
+        </w:rPr>
+        <w:t xml:space="preserve">Associated-but-deallocated VMs are separate.</w:t>
+      </w:r>
+      <w:r>
+        <w:t xml:space="preserve"> </w:t>
+      </w:r>
+      <w:r>
+        <w:t xml:space="preserve">They are visible in dashboards and restart-risk reporting, but they do not automatically force reservation retention unless policy explicitly requires it.</w:t>
+      </w:r>
+      <w:r>
+        <w:t xml:space="preserve"> </w:t>
+      </w:r>
+      <w:r>
+        <w:rPr>
+          <w:rStyle w:val="VerbatimChar"/>
+        </w:rPr>
+        <w:t xml:space="preserve">[Decided]</w:t>
       </w:r>
     </w:p>
     <w:p>
@@ -779,22 +563,28 @@
           <w:ilvl w:val="0"/>
           <w:numId w:val="1002"/>
         </w:numPr>
-        <w:pStyle w:val="Compact"/>
-      </w:pPr>
-      <w:r>
-        <w:t xml:space="preserve">Create</w:t>
-      </w:r>
-      <w:r>
-        <w:t xml:space="preserve"> </w:t>
-      </w:r>
-      <w:r>
-        <w:rPr>
-          <w:rStyle w:val="VerbatimChar"/>
-        </w:rPr>
-        <w:t xml:space="preserve">CapacityIncreaseRequest</w:t>
-      </w:r>
-      <w:r>
-        <w:t xml:space="preserve">.</w:t>
+      </w:pPr>
+      <w:r>
+        <w:rPr>
+          <w:bCs/>
+          <w:b/>
+        </w:rPr>
+        <w:t xml:space="preserve">The reconciliation interval is configurable.</w:t>
+      </w:r>
+      <w:r>
+        <w:t xml:space="preserve"> </w:t>
+      </w:r>
+      <w:r>
+        <w:t xml:space="preserve">The reference implementation runs as a container-app job every six minutes; production interval is tuned from API throttling, cost, operational risk, and deployment responsiveness.</w:t>
+      </w:r>
+      <w:r>
+        <w:t xml:space="preserve"> </w:t>
+      </w:r>
+      <w:r>
+        <w:rPr>
+          <w:rStyle w:val="VerbatimChar"/>
+        </w:rPr>
+        <w:t xml:space="preserve">[Decided]</w:t>
       </w:r>
     </w:p>
     <w:p>
@@ -803,22 +593,28 @@
           <w:ilvl w:val="0"/>
           <w:numId w:val="1002"/>
         </w:numPr>
-        <w:pStyle w:val="Compact"/>
-      </w:pPr>
-      <w:r>
-        <w:t xml:space="preserve">Calculate target quantity (</w:t>
-      </w:r>
-      <w:r>
-        <w:rPr>
-          <w:rStyle w:val="VerbatimChar"/>
-        </w:rPr>
-        <w:t xml:space="preserve">Forecast_Quantity</w:t>
-      </w:r>
-      <w:r>
-        <w:t xml:space="preserve"> </w:t>
-      </w:r>
-      <w:r>
-        <w:t xml:space="preserve">formula above).</w:t>
+      </w:pPr>
+      <w:r>
+        <w:rPr>
+          <w:bCs/>
+          <w:b/>
+        </w:rPr>
+        <w:t xml:space="preserve">Scale-up failure is surfaced, not hidden.</w:t>
+      </w:r>
+      <w:r>
+        <w:t xml:space="preserve"> </w:t>
+      </w:r>
+      <w:r>
+        <w:t xml:space="preserve">If allocated demand rises and Azure cannot supply capacity, ACRME holds the current safe state, raises an alert, exposes the buffer deficit, and records the Microsoft/Azure negotiation path.</w:t>
+      </w:r>
+      <w:r>
+        <w:t xml:space="preserve"> </w:t>
+      </w:r>
+      <w:r>
+        <w:rPr>
+          <w:rStyle w:val="VerbatimChar"/>
+        </w:rPr>
+        <w:t xml:space="preserve">[Decided]</w:t>
       </w:r>
     </w:p>
     <w:p>
@@ -827,14 +623,28 @@
           <w:ilvl w:val="0"/>
           <w:numId w:val="1002"/>
         </w:numPr>
-        <w:pStyle w:val="Compact"/>
-      </w:pPr>
-      <w:r>
-        <w:rPr>
-          <w:bCs/>
-          <w:b/>
-        </w:rPr>
-        <w:t xml:space="preserve">Require operator approval (Phase 1).</w:t>
+      </w:pPr>
+      <w:r>
+        <w:rPr>
+          <w:bCs/>
+          <w:b/>
+        </w:rPr>
+        <w:t xml:space="preserve">Scale-down is guarded.</w:t>
+      </w:r>
+      <w:r>
+        <w:t xml:space="preserve"> </w:t>
+      </w:r>
+      <w:r>
+        <w:t xml:space="preserve">Reductions apply minimum-hold interval, DR protection, maintenance exclusion, approved overrides, cost policy, and Azure safety validation.</w:t>
+      </w:r>
+      <w:r>
+        <w:t xml:space="preserve"> </w:t>
+      </w:r>
+      <w:r>
+        <w:rPr>
+          <w:rStyle w:val="VerbatimChar"/>
+        </w:rPr>
+        <w:t xml:space="preserve">[Decided]</w:t>
       </w:r>
     </w:p>
     <w:p>
@@ -843,146 +653,1168 @@
           <w:ilvl w:val="0"/>
           <w:numId w:val="1002"/>
         </w:numPr>
-        <w:pStyle w:val="Compact"/>
-      </w:pPr>
-      <w:r>
-        <w:t xml:space="preserve">Submit the quota action only if validated as required.</w:t>
+      </w:pPr>
+      <w:r>
+        <w:rPr>
+          <w:bCs/>
+          <w:b/>
+        </w:rPr>
+        <w:t xml:space="preserve">No automatic deletion.</w:t>
+      </w:r>
+      <w:r>
+        <w:t xml:space="preserve"> </w:t>
+      </w:r>
+      <w:r>
+        <w:t xml:space="preserve">Normal reconciliation can reduce to zero where Azure permits but never deletes CRGs or reservation definitions. Deletion is a separate approved decommissioning workflow.</w:t>
+      </w:r>
+      <w:r>
+        <w:t xml:space="preserve"> </w:t>
+      </w:r>
+      <w:r>
+        <w:rPr>
+          <w:rStyle w:val="VerbatimChar"/>
+        </w:rPr>
+        <w:t xml:space="preserve">[Decided]</w:t>
+      </w:r>
+    </w:p>
+    <w:bookmarkEnd w:id="21"/>
+    <w:bookmarkStart w:id="22" w:name="reconciliation-loop"/>
+    <w:p>
+      <w:pPr>
+        <w:pStyle w:val="Heading2"/>
+      </w:pPr>
+      <w:r>
+        <w:t xml:space="preserve">Reconciliation Loop</w:t>
+      </w:r>
+    </w:p>
+    <w:p>
+      <w:pPr>
+        <w:pStyle w:val="FirstParagraph"/>
+      </w:pPr>
+      <w:r>
+        <w:t xml:space="preserve">Each reconciliation cycle reads:</w:t>
       </w:r>
     </w:p>
     <w:p>
       <w:pPr>
         <w:numPr>
           <w:ilvl w:val="0"/>
-          <w:numId w:val="1002"/>
+          <w:numId w:val="1003"/>
         </w:numPr>
         <w:pStyle w:val="Compact"/>
       </w:pPr>
       <w:r>
-        <w:t xml:space="preserve">Wait for confirmed quota state</w:t>
-      </w:r>
-      <w:r>
-        <w:t xml:space="preserve"> </w:t>
-      </w:r>
-      <w:r>
-        <w:rPr>
-          <w:bCs/>
-          <w:b/>
-        </w:rPr>
-        <w:t xml:space="preserve">without assuming a propagation SLA</w:t>
-      </w:r>
-      <w:r>
-        <w:t xml:space="preserve">.</w:t>
+        <w:t xml:space="preserve">scope-file desired state and policy version;</w:t>
       </w:r>
     </w:p>
     <w:p>
       <w:pPr>
         <w:numPr>
           <w:ilvl w:val="0"/>
-          <w:numId w:val="1002"/>
+          <w:numId w:val="1003"/>
         </w:numPr>
         <w:pStyle w:val="Compact"/>
       </w:pPr>
       <w:r>
-        <w:t xml:space="preserve">Update CR quantity.</w:t>
+        <w:t xml:space="preserve">reservation quantity;</w:t>
       </w:r>
     </w:p>
     <w:p>
       <w:pPr>
         <w:numPr>
           <w:ilvl w:val="0"/>
-          <w:numId w:val="1002"/>
+          <w:numId w:val="1003"/>
         </w:numPr>
         <w:pStyle w:val="Compact"/>
       </w:pPr>
       <w:r>
-        <w:t xml:space="preserve">Confirm the actual quantity.</w:t>
+        <w:t xml:space="preserve">allocated VM count;</w:t>
       </w:r>
     </w:p>
     <w:p>
       <w:pPr>
         <w:numPr>
           <w:ilvl w:val="0"/>
-          <w:numId w:val="1002"/>
+          <w:numId w:val="1003"/>
         </w:numPr>
         <w:pStyle w:val="Compact"/>
       </w:pPr>
       <w:r>
-        <w:t xml:space="preserve">Refresh the snapshot and close the request.</w:t>
-      </w:r>
-    </w:p>
-    <w:p>
-      <w:pPr>
-        <w:pStyle w:val="CaptionedFigure"/>
-      </w:pPr>
-      <w:r>
-        <w:drawing>
-          <wp:inline>
-            <wp:extent cx="5334000" cy="24080304"/>
-            <wp:effectExtent b="0" l="0" r="0" t="0"/>
-            <wp:docPr descr="Figure 1. Ten-step steady-state capacity-increase lifecycle, running only in STEADY_STATE behind an operator-approval gate." title="" id="22" name="Picture"/>
-            <a:graphic>
-              <a:graphicData uri="http://schemas.openxmlformats.org/drawingml/2006/picture">
-                <pic:pic>
-                  <pic:nvPicPr>
-                    <pic:cNvPr descr="diagrams/adr004_lifecycle.png" id="23" name="Picture"/>
-                    <pic:cNvPicPr>
-                      <a:picLocks noChangeArrowheads="1" noChangeAspect="1"/>
-                    </pic:cNvPicPr>
-                  </pic:nvPicPr>
-                  <pic:blipFill>
-                    <a:blip r:embed="rId21"/>
-                    <a:stretch>
-                      <a:fillRect/>
-                    </a:stretch>
-                  </pic:blipFill>
-                  <pic:spPr bwMode="auto">
-                    <a:xfrm>
-                      <a:off x="0" y="0"/>
-                      <a:ext cx="5334000" cy="24080304"/>
-                    </a:xfrm>
-                    <a:prstGeom prst="rect">
-                      <a:avLst/>
-                    </a:prstGeom>
-                    <a:noFill/>
-                    <a:ln w="9525">
-                      <a:noFill/>
-                      <a:headEnd/>
-                      <a:tailEnd/>
-                    </a:ln>
-                  </pic:spPr>
-                </pic:pic>
-              </a:graphicData>
-            </a:graphic>
-          </wp:inline>
-        </w:drawing>
-      </w:r>
-    </w:p>
-    <w:p>
-      <w:pPr>
-        <w:pStyle w:val="ImageCaption"/>
-      </w:pPr>
-      <w:r>
-        <w:rPr>
-          <w:bCs/>
-          <w:b/>
-        </w:rPr>
-        <w:t xml:space="preserve">Figure 1.</w:t>
-      </w:r>
-      <w:r>
-        <w:t xml:space="preserve"> </w:t>
-      </w:r>
-      <w:r>
-        <w:t xml:space="preserve">Ten-step steady-state capacity-increase lifecycle, running only in STEADY_STATE behind an operator-approval gate.</w:t>
+        <w:t xml:space="preserve">associated VM count;</w:t>
+      </w:r>
+    </w:p>
+    <w:p>
+      <w:pPr>
+        <w:numPr>
+          <w:ilvl w:val="0"/>
+          <w:numId w:val="1003"/>
+        </w:numPr>
+        <w:pStyle w:val="Compact"/>
+      </w:pPr>
+      <w:r>
+        <w:t xml:space="preserve">available reserved capacity;</w:t>
+      </w:r>
+    </w:p>
+    <w:p>
+      <w:pPr>
+        <w:numPr>
+          <w:ilvl w:val="0"/>
+          <w:numId w:val="1003"/>
+        </w:numPr>
+        <w:pStyle w:val="Compact"/>
+      </w:pPr>
+      <w:r>
+        <w:t xml:space="preserve">configured production/DR buffer;</w:t>
+      </w:r>
+    </w:p>
+    <w:p>
+      <w:pPr>
+        <w:numPr>
+          <w:ilvl w:val="0"/>
+          <w:numId w:val="1003"/>
+        </w:numPr>
+        <w:pStyle w:val="Compact"/>
+      </w:pPr>
+      <w:r>
+        <w:t xml:space="preserve">quota assigned/used/available;</w:t>
+      </w:r>
+    </w:p>
+    <w:p>
+      <w:pPr>
+        <w:numPr>
+          <w:ilvl w:val="0"/>
+          <w:numId w:val="1003"/>
+        </w:numPr>
+        <w:pStyle w:val="Compact"/>
+      </w:pPr>
+      <w:r>
+        <w:t xml:space="preserve">sharing relationships;</w:t>
+      </w:r>
+    </w:p>
+    <w:p>
+      <w:pPr>
+        <w:numPr>
+          <w:ilvl w:val="0"/>
+          <w:numId w:val="1003"/>
+        </w:numPr>
+        <w:pStyle w:val="Compact"/>
+      </w:pPr>
+      <w:r>
+        <w:t xml:space="preserve">state age and Azure API health.</w:t>
+      </w:r>
+      <w:r>
+        <w:t xml:space="preserve"> </w:t>
+      </w:r>
+      <w:r>
+        <w:rPr>
+          <w:rStyle w:val="VerbatimChar"/>
+        </w:rPr>
+        <w:t xml:space="preserve">[Decided]</w:t>
+      </w:r>
+    </w:p>
+    <w:p>
+      <w:pPr>
+        <w:pStyle w:val="FirstParagraph"/>
+      </w:pPr>
+      <w:r>
+        <w:t xml:space="preserve">Decision logic:</w:t>
+      </w:r>
+    </w:p>
+    <w:p>
+      <w:pPr>
+        <w:pStyle w:val="SourceCode"/>
+      </w:pPr>
+      <w:r>
+        <w:rPr>
+          <w:rStyle w:val="VerbatimChar"/>
+        </w:rPr>
+        <w:t xml:space="preserve">target = allocated_vm_count + configured_buffer</w:t>
+      </w:r>
+      <w:r>
+        <w:br/>
+      </w:r>
+      <w:r>
+        <w:br/>
+      </w:r>
+      <w:r>
+        <w:rPr>
+          <w:rStyle w:val="VerbatimChar"/>
+        </w:rPr>
+        <w:t xml:space="preserve">if reserved_quantity &lt; target:</w:t>
+      </w:r>
+      <w:r>
+        <w:br/>
+      </w:r>
+      <w:r>
+        <w:rPr>
+          <w:rStyle w:val="VerbatimChar"/>
+        </w:rPr>
+        <w:t xml:space="preserve">    attempt scale-up to target</w:t>
+      </w:r>
+      <w:r>
+        <w:br/>
+      </w:r>
+      <w:r>
+        <w:rPr>
+          <w:rStyle w:val="VerbatimChar"/>
+        </w:rPr>
+        <w:t xml:space="preserve">    if Azure cannot supply:</w:t>
+      </w:r>
+      <w:r>
+        <w:br/>
+      </w:r>
+      <w:r>
+        <w:rPr>
+          <w:rStyle w:val="VerbatimChar"/>
+        </w:rPr>
+        <w:t xml:space="preserve">        keep current reservation</w:t>
+      </w:r>
+      <w:r>
+        <w:br/>
+      </w:r>
+      <w:r>
+        <w:rPr>
+          <w:rStyle w:val="VerbatimChar"/>
+        </w:rPr>
+        <w:t xml:space="preserve">        alert buffer deficit</w:t>
+      </w:r>
+      <w:r>
+        <w:br/>
+      </w:r>
+      <w:r>
+        <w:br/>
+      </w:r>
+      <w:r>
+        <w:rPr>
+          <w:rStyle w:val="VerbatimChar"/>
+        </w:rPr>
+        <w:t xml:space="preserve">if reserved_quantity &gt; target:</w:t>
+      </w:r>
+      <w:r>
+        <w:br/>
+      </w:r>
+      <w:r>
+        <w:rPr>
+          <w:rStyle w:val="VerbatimChar"/>
+        </w:rPr>
+        <w:t xml:space="preserve">    reduce toward target only after hold interval, DR guard,</w:t>
+      </w:r>
+      <w:r>
+        <w:br/>
+      </w:r>
+      <w:r>
+        <w:rPr>
+          <w:rStyle w:val="VerbatimChar"/>
+        </w:rPr>
+        <w:t xml:space="preserve">    maintenance exclusion, override, and cost-policy checks</w:t>
+      </w:r>
+    </w:p>
+    <w:p>
+      <w:pPr>
+        <w:pStyle w:val="FirstParagraph"/>
+      </w:pPr>
+      <w:r>
+        <w:t xml:space="preserve">The loop is idempotent, uses durable operation keys for mutations, and confirms Azure resource-provider state before committing engine state.</w:t>
+      </w:r>
+      <w:r>
+        <w:t xml:space="preserve"> </w:t>
+      </w:r>
+      <w:r>
+        <w:rPr>
+          <w:rStyle w:val="VerbatimChar"/>
+        </w:rPr>
+        <w:t xml:space="preserve">[Decided]</w:t>
+      </w:r>
+    </w:p>
+    <w:bookmarkEnd w:id="22"/>
+    <w:bookmarkStart w:id="25" w:name="Xdaa09da567392236d2671e03439a5fc816abdf7"/>
+    <w:p>
+      <w:pPr>
+        <w:pStyle w:val="Heading2"/>
+      </w:pPr>
+      <w:r>
+        <w:t xml:space="preserve">Seed Matrix Initialisation and Reactive Discovery (CAP-022, CAP-024)</w:t>
+      </w:r>
+    </w:p>
+    <w:p>
+      <w:pPr>
+        <w:pStyle w:val="FirstParagraph"/>
+      </w:pPr>
+      <w:r>
+        <w:t xml:space="preserve">The reconciliation floor above assumes a reservation object already exists for each managed SKU/AZ. Baseline v2.4 makes explicit</w:t>
+      </w:r>
+      <w:r>
+        <w:t xml:space="preserve"> </w:t>
+      </w:r>
+      <w:r>
+        <w:rPr>
+          <w:bCs/>
+          <w:b/>
+        </w:rPr>
+        <w:t xml:space="preserve">how that set of reservation objects comes into being</w:t>
+      </w:r>
+      <w:r>
+        <w:t xml:space="preserve"> </w:t>
+      </w:r>
+      <w:r>
+        <w:t xml:space="preserve">and</w:t>
+      </w:r>
+      <w:r>
+        <w:t xml:space="preserve"> </w:t>
+      </w:r>
+      <w:r>
+        <w:rPr>
+          <w:bCs/>
+          <w:b/>
+        </w:rPr>
+        <w:t xml:space="preserve">how newly-observed SKU/AZ combinations are absorbed</w:t>
+      </w:r>
+      <w:r>
+        <w:t xml:space="preserve"> </w:t>
+      </w:r>
+      <w:r>
+        <w:t xml:space="preserve">— the two ends of the reconciliation lifecycle that were previously implicit.</w:t>
+      </w:r>
+    </w:p>
+    <w:bookmarkStart w:id="23" w:name="X3aaa7731512e1e7b472216a4f8b82f6d3e417e9"/>
+    <w:p>
+      <w:pPr>
+        <w:pStyle w:val="Heading3"/>
+      </w:pPr>
+      <w:r>
+        <w:t xml:space="preserve">Seed-at-0 eligible-SKU/AZ matrix and budget governance — CAP-022</w:t>
+      </w:r>
+      <w:r>
+        <w:t xml:space="preserve"> </w:t>
+      </w:r>
+      <w:r>
+        <w:rPr>
+          <w:rStyle w:val="VerbatimChar"/>
+        </w:rPr>
+        <w:t xml:space="preserve">[Decided]</w:t>
+      </w:r>
+    </w:p>
+    <w:p>
+      <w:pPr>
+        <w:pStyle w:val="FirstParagraph"/>
+      </w:pPr>
+      <w:r>
+        <w:rPr>
+          <w:iCs/>
+          <w:i/>
+        </w:rPr>
+        <w:t xml:space="preserve">(Extends CAP-009 zero-capacity support.)</w:t>
+      </w:r>
+      <w:r>
+        <w:t xml:space="preserve"> </w:t>
+      </w:r>
+      <w:r>
+        <w:t xml:space="preserve">The managed set of</w:t>
+      </w:r>
+      <w:r>
+        <w:t xml:space="preserve"> </w:t>
+      </w:r>
+      <w:r>
+        <w:rPr>
+          <w:bCs/>
+          <w:b/>
+        </w:rPr>
+        <w:t xml:space="preserve">SKU/VM-family × region × availability-zone</w:t>
+      </w:r>
+      <w:r>
+        <w:t xml:space="preserve"> </w:t>
+      </w:r>
+      <w:r>
+        <w:t xml:space="preserve">combinations is initialised as a</w:t>
+      </w:r>
+      <w:r>
+        <w:t xml:space="preserve"> </w:t>
+      </w:r>
+      <w:r>
+        <w:rPr>
+          <w:bCs/>
+          <w:b/>
+        </w:rPr>
+        <w:t xml:space="preserve">seed matrix of count-0 reservations</w:t>
+      </w:r>
+      <w:r>
+        <w:t xml:space="preserve"> </w:t>
+      </w:r>
+      <w:r>
+        <w:t xml:space="preserve">(</w:t>
+      </w:r>
+      <w:r>
+        <w:t xml:space="preserve">“</w:t>
+      </w:r>
+      <w:r>
+        <w:rPr>
+          <w:bCs/>
+          <w:b/>
+        </w:rPr>
+        <w:t xml:space="preserve">seed reservations</w:t>
+      </w:r>
+      <w:r>
+        <w:t xml:space="preserve">”</w:t>
+      </w:r>
+      <w:r>
+        <w:t xml:space="preserve">). Normative rules:</w:t>
+      </w:r>
+    </w:p>
+    <w:p>
+      <w:pPr>
+        <w:numPr>
+          <w:ilvl w:val="0"/>
+          <w:numId w:val="1004"/>
+        </w:numPr>
+        <w:pStyle w:val="Compact"/>
+      </w:pPr>
+      <w:r>
+        <w:rPr>
+          <w:bCs/>
+          <w:b/>
+        </w:rPr>
+        <w:t xml:space="preserve">Seed at 0.</w:t>
+      </w:r>
+      <w:r>
+        <w:t xml:space="preserve"> </w:t>
+      </w:r>
+      <w:r>
+        <w:t xml:space="preserve">Every eligible combination in the scope file is created in Azure at reserved quantity</w:t>
+      </w:r>
+      <w:r>
+        <w:t xml:space="preserve"> </w:t>
+      </w:r>
+      <w:r>
+        <w:rPr>
+          <w:bCs/>
+          <w:b/>
+        </w:rPr>
+        <w:t xml:space="preserve">0</w:t>
+      </w:r>
+      <w:r>
+        <w:t xml:space="preserve"> </w:t>
+      </w:r>
+      <w:r>
+        <w:t xml:space="preserve">(CAP-009 zero-support) inside the correct</w:t>
+      </w:r>
+      <w:r>
+        <w:t xml:space="preserve"> </w:t>
+      </w:r>
+      <w:r>
+        <w:rPr>
+          <w:bCs/>
+          <w:b/>
+        </w:rPr>
+        <w:t xml:space="preserve">regional or per-AZ CRG</w:t>
+      </w:r>
+      <w:r>
+        <w:t xml:space="preserve"> </w:t>
+      </w:r>
+      <w:r>
+        <w:t xml:space="preserve">(CAP-023), so reconciliation can scale each up from a known baseline the instant allocated demand first appears (CAP-007). Reaching or starting at 0 is a normal state,</w:t>
+      </w:r>
+      <w:r>
+        <w:t xml:space="preserve"> </w:t>
+      </w:r>
+      <w:r>
+        <w:rPr>
+          <w:bCs/>
+          <w:b/>
+        </w:rPr>
+        <w:t xml:space="preserve">not</w:t>
+      </w:r>
+      <w:r>
+        <w:t xml:space="preserve"> </w:t>
+      </w:r>
+      <w:r>
+        <w:t xml:space="preserve">a decommission (CAP-010).</w:t>
+      </w:r>
+    </w:p>
+    <w:p>
+      <w:pPr>
+        <w:numPr>
+          <w:ilvl w:val="0"/>
+          <w:numId w:val="1004"/>
+        </w:numPr>
+        <w:pStyle w:val="Compact"/>
+      </w:pPr>
+      <w:r>
+        <w:rPr>
+          <w:bCs/>
+          <w:b/>
+        </w:rPr>
+        <w:t xml:space="preserve">Eligibility.</w:t>
+      </w:r>
+      <w:r>
+        <w:t xml:space="preserve"> </w:t>
+      </w:r>
+      <w:r>
+        <w:t xml:space="preserve">A combination is eligible only if its placement is</w:t>
+      </w:r>
+      <w:r>
+        <w:t xml:space="preserve"> </w:t>
+      </w:r>
+      <w:r>
+        <w:rPr>
+          <w:bCs/>
+          <w:b/>
+        </w:rPr>
+        <w:t xml:space="preserve">reservation-eligible</w:t>
+      </w:r>
+      <w:r>
+        <w:t xml:space="preserve"> </w:t>
+      </w:r>
+      <w:r>
+        <w:t xml:space="preserve">— an availability zone (preferred), or regional placement only where the SKU has no zonal reservation support (CAP-020). Availability-Set VMs are excluded and carry the CAP-021 deallocate/redeploy-to-AZ remediation.</w:t>
+      </w:r>
+    </w:p>
+    <w:p>
+      <w:pPr>
+        <w:numPr>
+          <w:ilvl w:val="0"/>
+          <w:numId w:val="1004"/>
+        </w:numPr>
+        <w:pStyle w:val="Compact"/>
+      </w:pPr>
+      <w:r>
+        <w:rPr>
+          <w:bCs/>
+          <w:b/>
+        </w:rPr>
+        <w:t xml:space="preserve">Budget governance.</w:t>
+      </w:r>
+      <w:r>
+        <w:t xml:space="preserve"> </w:t>
+      </w:r>
+      <w:r>
+        <w:t xml:space="preserve">A SKU/AZ combination enters the seed matrix</w:t>
+      </w:r>
+      <w:r>
+        <w:t xml:space="preserve"> </w:t>
+      </w:r>
+      <w:r>
+        <w:rPr>
+          <w:bCs/>
+          <w:b/>
+        </w:rPr>
+        <w:t xml:space="preserve">only with a named owning product team and an approved budget line</w:t>
+      </w:r>
+      <w:r>
+        <w:t xml:space="preserve">, because any reservation scaled above 0 incurs cost. Populating and expanding the matrix is therefore governed by</w:t>
+      </w:r>
+      <w:r>
+        <w:t xml:space="preserve"> </w:t>
+      </w:r>
+      <w:r>
+        <w:rPr>
+          <w:bCs/>
+          <w:b/>
+        </w:rPr>
+        <w:t xml:space="preserve">product-team budget approval</w:t>
+      </w:r>
+      <w:r>
+        <w:t xml:space="preserve">, not by the engine alone.</w:t>
+      </w:r>
+    </w:p>
+    <w:p>
+      <w:pPr>
+        <w:numPr>
+          <w:ilvl w:val="0"/>
+          <w:numId w:val="1004"/>
+        </w:numPr>
+        <w:pStyle w:val="Compact"/>
+      </w:pPr>
+      <w:r>
+        <w:rPr>
+          <w:bCs/>
+          <w:b/>
+        </w:rPr>
+        <w:t xml:space="preserve">Configuration-driven &amp; versioned.</w:t>
+      </w:r>
+      <w:r>
+        <w:t xml:space="preserve"> </w:t>
+      </w:r>
+      <w:r>
+        <w:t xml:space="preserve">The matrix, its eligibility rules, and its budget owners live in the</w:t>
+      </w:r>
+      <w:r>
+        <w:t xml:space="preserve"> </w:t>
+      </w:r>
+      <w:r>
+        <w:rPr>
+          <w:bCs/>
+          <w:b/>
+        </w:rPr>
+        <w:t xml:space="preserve">scope file</w:t>
+      </w:r>
+      <w:r>
+        <w:t xml:space="preserve"> </w:t>
+      </w:r>
+      <w:r>
+        <w:t xml:space="preserve">(CAP-019) and are versioned; changes follow scope-file governance.</w:t>
+      </w:r>
+    </w:p>
+    <w:p>
+      <w:pPr>
+        <w:numPr>
+          <w:ilvl w:val="0"/>
+          <w:numId w:val="1004"/>
+        </w:numPr>
+        <w:pStyle w:val="Compact"/>
+      </w:pPr>
+      <w:r>
+        <w:rPr>
+          <w:bCs/>
+          <w:b/>
+        </w:rPr>
+        <w:t xml:space="preserve">Terminology.</w:t>
+      </w:r>
+      <w:r>
+        <w:t xml:space="preserve"> </w:t>
+      </w:r>
+      <w:r>
+        <w:t xml:space="preserve">A</w:t>
+      </w:r>
+      <w:r>
+        <w:t xml:space="preserve"> </w:t>
+      </w:r>
+      <w:r>
+        <w:t xml:space="preserve">“</w:t>
+      </w:r>
+      <w:r>
+        <w:rPr>
+          <w:bCs/>
+          <w:b/>
+        </w:rPr>
+        <w:t xml:space="preserve">seed reservation</w:t>
+      </w:r>
+      <w:r>
+        <w:t xml:space="preserve">”</w:t>
+      </w:r>
+      <w:r>
+        <w:t xml:space="preserve"> </w:t>
+      </w:r>
+      <w:r>
+        <w:t xml:space="preserve">here is a</w:t>
+      </w:r>
+      <w:r>
+        <w:t xml:space="preserve"> </w:t>
+      </w:r>
+      <w:r>
+        <w:rPr>
+          <w:bCs/>
+          <w:b/>
+        </w:rPr>
+        <w:t xml:space="preserve">zero-count capacity reservation</w:t>
+      </w:r>
+      <w:r>
+        <w:t xml:space="preserve"> </w:t>
+      </w:r>
+      <w:r>
+        <w:t xml:space="preserve">— distinct from the placement</w:t>
+      </w:r>
+      <w:r>
+        <w:t xml:space="preserve"> </w:t>
+      </w:r>
+      <w:r>
+        <w:rPr>
+          <w:bCs/>
+          <w:b/>
+        </w:rPr>
+        <w:t xml:space="preserve">seed record</w:t>
+      </w:r>
+      <w:r>
+        <w:t xml:space="preserve"> </w:t>
+      </w:r>
+      <w:r>
+        <w:t xml:space="preserve">(</w:t>
+      </w:r>
+      <w:r>
+        <w:rPr>
+          <w:rStyle w:val="VerbatimChar"/>
+        </w:rPr>
+        <w:t xml:space="preserve">CustomerSeedRecord</w:t>
+      </w:r>
+      <w:r>
+        <w:t xml:space="preserve">, PLC-003), which records</w:t>
+      </w:r>
+      <w:r>
+        <w:t xml:space="preserve"> </w:t>
+      </w:r>
+      <w:r>
+        <w:rPr>
+          <w:iCs/>
+          <w:i/>
+        </w:rPr>
+        <w:t xml:space="preserve">where</w:t>
+      </w:r>
+      <w:r>
+        <w:t xml:space="preserve"> </w:t>
+      </w:r>
+      <w:r>
+        <w:t xml:space="preserve">a customer is placed. This ADR never conflates the two.</w:t>
+      </w:r>
+    </w:p>
+    <w:p>
+      <w:pPr>
+        <w:pStyle w:val="SourceCode"/>
+      </w:pPr>
+      <w:r>
+        <w:rPr>
+          <w:rStyle w:val="VerbatimChar"/>
+        </w:rPr>
+        <w:t xml:space="preserve"># Seed-matrix initialisation (per scope-file entry)</w:t>
+      </w:r>
+      <w:r>
+        <w:br/>
+      </w:r>
+      <w:r>
+        <w:rPr>
+          <w:rStyle w:val="VerbatimChar"/>
+        </w:rPr>
+        <w:t xml:space="preserve">for (sku, region, az) in scope_file.eligible_combinations:</w:t>
+      </w:r>
+      <w:r>
+        <w:br/>
+      </w:r>
+      <w:r>
+        <w:rPr>
+          <w:rStyle w:val="VerbatimChar"/>
+        </w:rPr>
+        <w:t xml:space="preserve">    assert placement_is_reservation_eligible(sku, region, az)      # CAP-020</w:t>
+      </w:r>
+      <w:r>
+        <w:br/>
+      </w:r>
+      <w:r>
+        <w:rPr>
+          <w:rStyle w:val="VerbatimChar"/>
+        </w:rPr>
+        <w:t xml:space="preserve">    assert has_owning_product_team(sku) and has_approved_budget(sku) # CAP-022 governance</w:t>
+      </w:r>
+      <w:r>
+        <w:br/>
+      </w:r>
+      <w:r>
+        <w:rPr>
+          <w:rStyle w:val="VerbatimChar"/>
+        </w:rPr>
+        <w:t xml:space="preserve">    crg = resolve_crg(env, region, az)        # per-AZ CRG, or regional CRG if SKU non-zonal (CAP-023)</w:t>
+      </w:r>
+      <w:r>
+        <w:br/>
+      </w:r>
+      <w:r>
+        <w:rPr>
+          <w:rStyle w:val="VerbatimChar"/>
+        </w:rPr>
+        <w:t xml:space="preserve">    ensure_crg_exists(crg)                     # name per OPS-006 / C-12</w:t>
+      </w:r>
+      <w:r>
+        <w:br/>
+      </w:r>
+      <w:r>
+        <w:rPr>
+          <w:rStyle w:val="VerbatimChar"/>
+        </w:rPr>
+        <w:t xml:space="preserve">    ensure_reservation(crg, sku, quantity=0)   # seed reservation at 0 (CAP-009)</w:t>
+      </w:r>
+      <w:r>
+        <w:br/>
+      </w:r>
+      <w:r>
+        <w:rPr>
+          <w:rStyle w:val="VerbatimChar"/>
+        </w:rPr>
+        <w:t xml:space="preserve"># Reconciliation later scales each seed up from 0 on first allocated demand (CAP-003/CAP-007)</w:t>
+      </w:r>
+    </w:p>
+    <w:bookmarkEnd w:id="23"/>
+    <w:bookmarkStart w:id="24" w:name="Xd593ff4daa58e69774c145c7c32d5e609d418ad"/>
+    <w:p>
+      <w:pPr>
+        <w:pStyle w:val="Heading3"/>
+      </w:pPr>
+      <w:r>
+        <w:t xml:space="preserve">Reactive SKU/AZ discovery reconciled with governance — CAP-024</w:t>
+      </w:r>
+      <w:r>
+        <w:t xml:space="preserve"> </w:t>
+      </w:r>
+      <w:r>
+        <w:rPr>
+          <w:rStyle w:val="VerbatimChar"/>
+        </w:rPr>
+        <w:t xml:space="preserve">[Decided]</w:t>
+      </w:r>
+    </w:p>
+    <w:p>
+      <w:pPr>
+        <w:pStyle w:val="FirstParagraph"/>
+      </w:pPr>
+      <w:r>
+        <w:rPr>
+          <w:iCs/>
+          <w:i/>
+        </w:rPr>
+        <w:t xml:space="preserve">(Reconciles CAP-019 scope-file governance with CAP-002 Azure-first protection.)</w:t>
+      </w:r>
+      <w:r>
+        <w:t xml:space="preserve"> </w:t>
+      </w:r>
+      <w:r>
+        <w:t xml:space="preserve">When reconciliation or a deployment detects an</w:t>
+      </w:r>
+      <w:r>
+        <w:t xml:space="preserve"> </w:t>
+      </w:r>
+      <w:r>
+        <w:rPr>
+          <w:bCs/>
+          <w:b/>
+        </w:rPr>
+        <w:t xml:space="preserve">allocated VM of a SKU/AZ combination not yet in the seed matrix</w:t>
+      </w:r>
+      <w:r>
+        <w:t xml:space="preserve"> </w:t>
+      </w:r>
+      <w:r>
+        <w:t xml:space="preserve">(e.g. a product team deployed a new SKU), the engine performs</w:t>
+      </w:r>
+      <w:r>
+        <w:t xml:space="preserve"> </w:t>
+      </w:r>
+      <w:r>
+        <w:rPr>
+          <w:bCs/>
+          <w:b/>
+        </w:rPr>
+        <w:t xml:space="preserve">both</w:t>
+      </w:r>
+      <w:r>
+        <w:t xml:space="preserve"> </w:t>
+      </w:r>
+      <w:r>
+        <w:t xml:space="preserve">of the following, in order, so that live production is never left unprotected while governance catches up:</w:t>
+      </w:r>
+    </w:p>
+    <w:p>
+      <w:pPr>
+        <w:numPr>
+          <w:ilvl w:val="0"/>
+          <w:numId w:val="1005"/>
+        </w:numPr>
+        <w:pStyle w:val="Compact"/>
+      </w:pPr>
+      <w:r>
+        <w:rPr>
+          <w:bCs/>
+          <w:b/>
+        </w:rPr>
+        <w:t xml:space="preserve">Protect capacity first (auto-create).</w:t>
+      </w:r>
+      <w:r>
+        <w:t xml:space="preserve"> </w:t>
+      </w:r>
+      <w:r>
+        <w:t xml:space="preserve">Auto-create the corresponding reservation — the</w:t>
+      </w:r>
+      <w:r>
+        <w:t xml:space="preserve"> </w:t>
+      </w:r>
+      <w:r>
+        <w:rPr>
+          <w:bCs/>
+          <w:b/>
+        </w:rPr>
+        <w:t xml:space="preserve">CRG if absent</w:t>
+      </w:r>
+      <w:r>
+        <w:t xml:space="preserve"> </w:t>
+      </w:r>
+      <w:r>
+        <w:t xml:space="preserve">plus a reservation sized at</w:t>
+      </w:r>
+      <w:r>
+        <w:t xml:space="preserve"> </w:t>
+      </w:r>
+      <w:r>
+        <w:rPr>
+          <w:rStyle w:val="VerbatimChar"/>
+          <w:bCs/>
+          <w:b/>
+        </w:rPr>
+        <w:t xml:space="preserve">allocated + buffer</w:t>
+      </w:r>
+      <w:r>
+        <w:t xml:space="preserve"> </w:t>
+      </w:r>
+      <w:r>
+        <w:t xml:space="preserve">(CAP-003) in the correct</w:t>
+      </w:r>
+      <w:r>
+        <w:t xml:space="preserve"> </w:t>
+      </w:r>
+      <w:r>
+        <w:rPr>
+          <w:bCs/>
+          <w:b/>
+        </w:rPr>
+        <w:t xml:space="preserve">per-AZ or regional CRG</w:t>
+      </w:r>
+      <w:r>
+        <w:t xml:space="preserve"> </w:t>
+      </w:r>
+      <w:r>
+        <w:t xml:space="preserve">(CAP-023). This protects production immediately and preserves CAP-002 (the Azure resource still precedes config activation).</w:t>
+      </w:r>
+    </w:p>
+    <w:p>
+      <w:pPr>
+        <w:numPr>
+          <w:ilvl w:val="0"/>
+          <w:numId w:val="1005"/>
+        </w:numPr>
+        <w:pStyle w:val="Compact"/>
+      </w:pPr>
+      <w:r>
+        <w:rPr>
+          <w:bCs/>
+          <w:b/>
+        </w:rPr>
+        <w:t xml:space="preserve">Raise governance simultaneously.</w:t>
+      </w:r>
+      <w:r>
+        <w:t xml:space="preserve"> </w:t>
+      </w:r>
+      <w:r>
+        <w:t xml:space="preserve">Raise a</w:t>
+      </w:r>
+      <w:r>
+        <w:t xml:space="preserve"> </w:t>
+      </w:r>
+      <w:r>
+        <w:rPr>
+          <w:bCs/>
+          <w:b/>
+        </w:rPr>
+        <w:t xml:space="preserve">scope-file governance item</w:t>
+      </w:r>
+      <w:r>
+        <w:t xml:space="preserve"> </w:t>
+      </w:r>
+      <w:r>
+        <w:t xml:space="preserve">(CAP-019) so the discovered SKU/AZ is ratified into the scope file with an</w:t>
+      </w:r>
+      <w:r>
+        <w:t xml:space="preserve"> </w:t>
+      </w:r>
+      <w:r>
+        <w:rPr>
+          <w:bCs/>
+          <w:b/>
+        </w:rPr>
+        <w:t xml:space="preserve">owning product team and budget</w:t>
+      </w:r>
+      <w:r>
+        <w:t xml:space="preserve"> </w:t>
+      </w:r>
+      <w:r>
+        <w:t xml:space="preserve">(CAP-022).</w:t>
+      </w:r>
+    </w:p>
+    <w:p>
+      <w:pPr>
+        <w:numPr>
+          <w:ilvl w:val="0"/>
+          <w:numId w:val="1005"/>
+        </w:numPr>
+        <w:pStyle w:val="Compact"/>
+      </w:pPr>
+      <w:r>
+        <w:rPr>
+          <w:bCs/>
+          <w:b/>
+        </w:rPr>
+        <w:t xml:space="preserve">Reconcile to authoritative or roll back.</w:t>
+      </w:r>
+      <w:r>
+        <w:t xml:space="preserve"> </w:t>
+      </w:r>
+      <w:r>
+        <w:t xml:space="preserve">Governance reconciliation then either makes the reactive addition</w:t>
+      </w:r>
+      <w:r>
+        <w:t xml:space="preserve"> </w:t>
+      </w:r>
+      <w:r>
+        <w:rPr>
+          <w:bCs/>
+          <w:b/>
+        </w:rPr>
+        <w:t xml:space="preserve">authoritative</w:t>
+      </w:r>
+      <w:r>
+        <w:t xml:space="preserve"> </w:t>
+      </w:r>
+      <w:r>
+        <w:t xml:space="preserve">(ratified into the versioned scope file), or — if rejected — triggers the</w:t>
+      </w:r>
+      <w:r>
+        <w:t xml:space="preserve"> </w:t>
+      </w:r>
+      <w:r>
+        <w:rPr>
+          <w:bCs/>
+          <w:b/>
+        </w:rPr>
+        <w:t xml:space="preserve">approved decommissioning workflow</w:t>
+      </w:r>
+      <w:r>
+        <w:t xml:space="preserve"> </w:t>
+      </w:r>
+      <w:r>
+        <w:t xml:space="preserve">(CAP-010) to roll the reactive reservation back. Reconciliation itself never deletes the reactive reservation; only the decommissioning workflow does.</w:t>
+      </w:r>
+    </w:p>
+    <w:p>
+      <w:pPr>
+        <w:numPr>
+          <w:ilvl w:val="0"/>
+          <w:numId w:val="1005"/>
+        </w:numPr>
+        <w:pStyle w:val="Compact"/>
+      </w:pPr>
+      <w:r>
+        <w:rPr>
+          <w:bCs/>
+          <w:b/>
+        </w:rPr>
+        <w:t xml:space="preserve">Governance SLA, not precondition.</w:t>
+      </w:r>
+      <w:r>
+        <w:t xml:space="preserve"> </w:t>
+      </w:r>
+      <w:r>
+        <w:t xml:space="preserve">Scope-file consistency (CAP-019) is restored</w:t>
+      </w:r>
+      <w:r>
+        <w:t xml:space="preserve"> </w:t>
+      </w:r>
+      <w:r>
+        <w:rPr>
+          <w:bCs/>
+          <w:b/>
+        </w:rPr>
+        <w:t xml:space="preserve">within the governance SLA</w:t>
+      </w:r>
+      <w:r>
+        <w:t xml:space="preserve"> </w:t>
+      </w:r>
+      <w:r>
+        <w:t xml:space="preserve">rather than being a blocking precondition of protecting live production — this is the explicit resolution of the CAP-019 ↔ CAP-002 tension.</w:t>
+      </w:r>
+    </w:p>
+    <w:p>
+      <w:pPr>
+        <w:pStyle w:val="SourceCode"/>
+      </w:pPr>
+      <w:r>
+        <w:rPr>
+          <w:rStyle w:val="VerbatimChar"/>
+        </w:rPr>
+        <w:t xml:space="preserve"># Reactive discovery (per reconciliation cycle)</w:t>
+      </w:r>
+      <w:r>
+        <w:br/>
+      </w:r>
+      <w:r>
+        <w:rPr>
+          <w:rStyle w:val="VerbatimChar"/>
+        </w:rPr>
+        <w:t xml:space="preserve">for vm in allocated_vms:</w:t>
+      </w:r>
+      <w:r>
+        <w:br/>
+      </w:r>
+      <w:r>
+        <w:rPr>
+          <w:rStyle w:val="VerbatimChar"/>
+        </w:rPr>
+        <w:t xml:space="preserve">    key = (vm.sku, vm.region, vm.az)</w:t>
+      </w:r>
+      <w:r>
+        <w:br/>
+      </w:r>
+      <w:r>
+        <w:rPr>
+          <w:rStyle w:val="VerbatimChar"/>
+        </w:rPr>
+        <w:t xml:space="preserve">    if key not in seed_matrix and reservation_eligible(vm):     # CAP-020 gate</w:t>
+      </w:r>
+      <w:r>
+        <w:br/>
+      </w:r>
+      <w:r>
+        <w:rPr>
+          <w:rStyle w:val="VerbatimChar"/>
+        </w:rPr>
+        <w:t xml:space="preserve">        crg = resolve_crg(vm.env, vm.region, vm.az)             # CAP-023</w:t>
+      </w:r>
+      <w:r>
+        <w:br/>
+      </w:r>
+      <w:r>
+        <w:rPr>
+          <w:rStyle w:val="VerbatimChar"/>
+        </w:rPr>
+        <w:t xml:space="preserve">        ensure_crg_exists(crg)                                  # OPS-006 / C-12 name</w:t>
+      </w:r>
+      <w:r>
+        <w:br/>
+      </w:r>
+      <w:r>
+        <w:rPr>
+          <w:rStyle w:val="VerbatimChar"/>
+        </w:rPr>
+        <w:t xml:space="preserve">        ensure_reservation(crg, vm.sku, quantity=allocated(key) + buffer)  # CAP-003 — protect now</w:t>
+      </w:r>
+      <w:r>
+        <w:br/>
+      </w:r>
+      <w:r>
+        <w:rPr>
+          <w:rStyle w:val="VerbatimChar"/>
+        </w:rPr>
+        <w:t xml:space="preserve">        raise_scope_file_governance_item(key, needs=["product_team", "budget"])  # CAP-019/CAP-022</w:t>
+      </w:r>
+      <w:r>
+        <w:br/>
+      </w:r>
+      <w:r>
+        <w:rPr>
+          <w:rStyle w:val="VerbatimChar"/>
+        </w:rPr>
+        <w:t xml:space="preserve">        # ratify -&gt; authoritative in versioned scope file, OR reject -&gt; decommissioning workflow (CAP-010)</w:t>
+      </w:r>
+    </w:p>
+    <w:p>
+      <w:pPr>
+        <w:pStyle w:val="FirstParagraph"/>
+      </w:pPr>
+      <w:r>
+        <w:t xml:space="preserve">Both flows emit operation resources, durable operation keys, and audit records on the same terms as the reconciliation loop, and surface readiness/alerting states (below) — e.g. a reactive auto-create with a pending governance item is reported distinctly from a fully-ratified reservation.</w:t>
       </w:r>
     </w:p>
     <w:bookmarkEnd w:id="24"/>
-    <w:bookmarkStart w:id="25" w:name="auto-decrease-exclusion"/>
-    <w:p>
-      <w:pPr>
-        <w:pStyle w:val="Heading4"/>
-      </w:pPr>
-      <w:r>
-        <w:t xml:space="preserve">Auto-Decrease Exclusion</w:t>
+    <w:bookmarkEnd w:id="25"/>
+    <w:bookmarkStart w:id="26" w:name="forecast-and-increase-formula"/>
+    <w:p>
+      <w:pPr>
+        <w:pStyle w:val="Heading2"/>
+      </w:pPr>
+      <w:r>
+        <w:t xml:space="preserve">Forecast and Increase Formula</w:t>
       </w:r>
     </w:p>
     <w:p>
@@ -990,39 +1822,18 @@
         <w:pStyle w:val="FirstParagraph"/>
       </w:pPr>
       <w:r>
-        <w:t xml:space="preserve">Auto-decrease is</w:t>
-      </w:r>
-      <w:r>
-        <w:t xml:space="preserve"> </w:t>
-      </w:r>
-      <w:r>
-        <w:rPr>
-          <w:bCs/>
-          <w:b/>
-        </w:rPr>
-        <w:t xml:space="preserve">excluded from Phase 1</w:t>
-      </w:r>
-      <w:r>
-        <w:t xml:space="preserve">: it can remove future capacity and interact with running VMs. Right-sizing down remains operator-driven and guarded by the platform floor (never below allocated count).</w:t>
-      </w:r>
-      <w:r>
-        <w:t xml:space="preserve"> </w:t>
-      </w:r>
-      <w:r>
-        <w:rPr>
-          <w:rStyle w:val="VerbatimChar"/>
-        </w:rPr>
-        <w:t xml:space="preserve">[Documented]</w:t>
-      </w:r>
-    </w:p>
-    <w:bookmarkEnd w:id="25"/>
-    <w:bookmarkStart w:id="26" w:name="forecast-advisory-posture"/>
-    <w:p>
-      <w:pPr>
-        <w:pStyle w:val="Heading4"/>
-      </w:pPr>
-      <w:r>
-        <w:t xml:space="preserve">Forecast Advisory Posture</w:t>
+        <w:t xml:space="preserve">Forecasting remains a separate planning signal:</w:t>
+      </w:r>
+    </w:p>
+    <w:p>
+      <w:pPr>
+        <w:pStyle w:val="SourceCode"/>
+      </w:pPr>
+      <w:r>
+        <w:rPr>
+          <w:rStyle w:val="VerbatimChar"/>
+        </w:rPr>
+        <w:t xml:space="preserve">Forecast_Quantity = ceil(Forecast_Peak * (1 + Growth_Buffer) + Approved_DR_Buffer)</w:t>
       </w:r>
     </w:p>
     <w:p>
@@ -1030,24 +1841,35 @@
         <w:pStyle w:val="FirstParagraph"/>
       </w:pPr>
       <w:r>
-        <w:t xml:space="preserve">Forecast recommendations stay</w:t>
-      </w:r>
-      <w:r>
-        <w:t xml:space="preserve"> </w:t>
-      </w:r>
-      <w:r>
-        <w:rPr>
-          <w:bCs/>
-          <w:b/>
-        </w:rPr>
-        <w:t xml:space="preserve">advisory until model accuracy and false-positive rates are measured</w:t>
-      </w:r>
-      <w:r>
-        <w:t xml:space="preserve">; the horizon is 30/60/90 days and</w:t>
-      </w:r>
-      <w:r>
-        <w:t xml:space="preserve"> </w:t>
-      </w:r>
+        <w:t xml:space="preserve">Variables:</w:t>
+      </w:r>
+    </w:p>
+    <w:p>
+      <w:pPr>
+        <w:numPr>
+          <w:ilvl w:val="0"/>
+          <w:numId w:val="1006"/>
+        </w:numPr>
+        <w:pStyle w:val="Compact"/>
+      </w:pPr>
+      <w:r>
+        <w:rPr>
+          <w:rStyle w:val="VerbatimChar"/>
+        </w:rPr>
+        <w:t xml:space="preserve">Forecast_Peak</w:t>
+      </w:r>
+      <w:r>
+        <w:t xml:space="preserve">: predicted peak allocated or policy-protected demand for the horizon;</w:t>
+      </w:r>
+    </w:p>
+    <w:p>
+      <w:pPr>
+        <w:numPr>
+          <w:ilvl w:val="0"/>
+          <w:numId w:val="1006"/>
+        </w:numPr>
+        <w:pStyle w:val="Compact"/>
+      </w:pPr>
       <w:r>
         <w:rPr>
           <w:rStyle w:val="VerbatimChar"/>
@@ -1055,39 +1877,234 @@
         <w:t xml:space="preserve">Growth_Buffer</w:t>
       </w:r>
       <w:r>
-        <w:t xml:space="preserve">/</w:t>
-      </w:r>
-      <w:r>
-        <w:rPr>
-          <w:rStyle w:val="VerbatimChar"/>
-        </w:rPr>
-        <w:t xml:space="preserve">DR_Buffer</w:t>
-      </w:r>
-      <w:r>
-        <w:t xml:space="preserve"> </w:t>
-      </w:r>
-      <w:r>
-        <w:t xml:space="preserve">are policy percentages, not fixed constants.</w:t>
-      </w:r>
-      <w:r>
-        <w:t xml:space="preserve"> </w:t>
-      </w:r>
-      <w:r>
-        <w:rPr>
-          <w:rStyle w:val="VerbatimChar"/>
-        </w:rPr>
-        <w:t xml:space="preserve">[Documented]</w:t>
+        <w:t xml:space="preserve">: configurable uncertainty/growth percentage;</w:t>
+      </w:r>
+    </w:p>
+    <w:p>
+      <w:pPr>
+        <w:numPr>
+          <w:ilvl w:val="0"/>
+          <w:numId w:val="1006"/>
+        </w:numPr>
+        <w:pStyle w:val="Compact"/>
+      </w:pPr>
+      <w:r>
+        <w:rPr>
+          <w:rStyle w:val="VerbatimChar"/>
+        </w:rPr>
+        <w:t xml:space="preserve">Approved_DR_Buffer</w:t>
+      </w:r>
+      <w:r>
+        <w:t xml:space="preserve">: DR-specific buffer from ADR-003 policy, not a fixed percentage clone;</w:t>
+      </w:r>
+    </w:p>
+    <w:p>
+      <w:pPr>
+        <w:numPr>
+          <w:ilvl w:val="0"/>
+          <w:numId w:val="1006"/>
+        </w:numPr>
+        <w:pStyle w:val="Compact"/>
+      </w:pPr>
+      <w:r>
+        <w:rPr>
+          <w:rStyle w:val="VerbatimChar"/>
+        </w:rPr>
+        <w:t xml:space="preserve">Forecast_Horizon</w:t>
+      </w:r>
+      <w:r>
+        <w:t xml:space="preserve">: configurable, with 30/60/90 days retained as starting options.</w:t>
+      </w:r>
+      <w:r>
+        <w:t xml:space="preserve"> </w:t>
+      </w:r>
+      <w:r>
+        <w:rPr>
+          <w:rStyle w:val="VerbatimChar"/>
+        </w:rPr>
+        <w:t xml:space="preserve">[Decided]</w:t>
+      </w:r>
+    </w:p>
+    <w:p>
+      <w:pPr>
+        <w:pStyle w:val="FirstParagraph"/>
+      </w:pPr>
+      <w:r>
+        <w:t xml:space="preserve">Forecast output can create a</w:t>
+      </w:r>
+      <w:r>
+        <w:t xml:space="preserve"> </w:t>
+      </w:r>
+      <w:r>
+        <w:rPr>
+          <w:rStyle w:val="VerbatimChar"/>
+        </w:rPr>
+        <w:t xml:space="preserve">CapacityIncreaseRequest</w:t>
+      </w:r>
+      <w:r>
+        <w:t xml:space="preserve"> </w:t>
+      </w:r>
+      <w:r>
+        <w:t xml:space="preserve">or</w:t>
+      </w:r>
+      <w:r>
+        <w:t xml:space="preserve"> </w:t>
+      </w:r>
+      <w:r>
+        <w:rPr>
+          <w:rStyle w:val="VerbatimChar"/>
+        </w:rPr>
+        <w:t xml:space="preserve">QuotaIncreaseRequest</w:t>
+      </w:r>
+      <w:r>
+        <w:t xml:space="preserve">, but Phase 1 execution remains approval-gated.</w:t>
+      </w:r>
+      <w:r>
+        <w:t xml:space="preserve"> </w:t>
+      </w:r>
+      <w:r>
+        <w:rPr>
+          <w:rStyle w:val="VerbatimChar"/>
+        </w:rPr>
+        <w:t xml:space="preserve">[Decided]</w:t>
       </w:r>
     </w:p>
     <w:bookmarkEnd w:id="26"/>
+    <w:bookmarkStart w:id="27" w:name="capacity-and-quota-increase-workflow"/>
+    <w:p>
+      <w:pPr>
+        <w:pStyle w:val="Heading2"/>
+      </w:pPr>
+      <w:r>
+        <w:t xml:space="preserve">Capacity and Quota Increase Workflow</w:t>
+      </w:r>
+    </w:p>
+    <w:p>
+      <w:pPr>
+        <w:pStyle w:val="SourceCode"/>
+      </w:pPr>
+      <w:r>
+        <w:rPr>
+          <w:rStyle w:val="VerbatimChar"/>
+        </w:rPr>
+        <w:t xml:space="preserve">flowchart TD</w:t>
+      </w:r>
+      <w:r>
+        <w:br/>
+      </w:r>
+      <w:r>
+        <w:rPr>
+          <w:rStyle w:val="VerbatimChar"/>
+        </w:rPr>
+        <w:t xml:space="preserve">    Detect[Detect threshold or forecast breach] --&gt; Refresh[Read current capacity, quota, sharing, seed, and policy state]</w:t>
+      </w:r>
+      <w:r>
+        <w:br/>
+      </w:r>
+      <w:r>
+        <w:rPr>
+          <w:rStyle w:val="VerbatimChar"/>
+        </w:rPr>
+        <w:t xml:space="preserve">    Refresh --&gt; Request[Create CapacityIncreaseRequest or QuotaIncreaseRequest]</w:t>
+      </w:r>
+      <w:r>
+        <w:br/>
+      </w:r>
+      <w:r>
+        <w:rPr>
+          <w:rStyle w:val="VerbatimChar"/>
+        </w:rPr>
+        <w:t xml:space="preserve">    Request --&gt; Readiness[Evaluate DeploymentReadinessResult]</w:t>
+      </w:r>
+      <w:r>
+        <w:br/>
+      </w:r>
+      <w:r>
+        <w:rPr>
+          <w:rStyle w:val="VerbatimChar"/>
+        </w:rPr>
+        <w:t xml:space="preserve">    Readiness --&gt; Approve{Approval required?}</w:t>
+      </w:r>
+      <w:r>
+        <w:br/>
+      </w:r>
+      <w:r>
+        <w:rPr>
+          <w:rStyle w:val="VerbatimChar"/>
+        </w:rPr>
+        <w:t xml:space="preserve">    Approve -- Yes --&gt; Wait[Wait for operator approval]</w:t>
+      </w:r>
+      <w:r>
+        <w:br/>
+      </w:r>
+      <w:r>
+        <w:rPr>
+          <w:rStyle w:val="VerbatimChar"/>
+        </w:rPr>
+        <w:t xml:space="preserve">    Approve -- No --&gt; Execute[Execute allowed increase]</w:t>
+      </w:r>
+      <w:r>
+        <w:br/>
+      </w:r>
+      <w:r>
+        <w:rPr>
+          <w:rStyle w:val="VerbatimChar"/>
+        </w:rPr>
+        <w:t xml:space="preserve">    Wait --&gt; Execute</w:t>
+      </w:r>
+      <w:r>
+        <w:br/>
+      </w:r>
+      <w:r>
+        <w:rPr>
+          <w:rStyle w:val="VerbatimChar"/>
+        </w:rPr>
+        <w:t xml:space="preserve">    Execute --&gt; Poll[Poll Azure operation and quota state]</w:t>
+      </w:r>
+      <w:r>
+        <w:br/>
+      </w:r>
+      <w:r>
+        <w:rPr>
+          <w:rStyle w:val="VerbatimChar"/>
+        </w:rPr>
+        <w:t xml:space="preserve">    Poll --&gt; Confirm[Confirm actual CR/quota state]</w:t>
+      </w:r>
+      <w:r>
+        <w:br/>
+      </w:r>
+      <w:r>
+        <w:rPr>
+          <w:rStyle w:val="VerbatimChar"/>
+        </w:rPr>
+        <w:t xml:space="preserve">    Confirm --&gt; Snapshot[Refresh snapshot and close request]</w:t>
+      </w:r>
+    </w:p>
+    <w:p>
+      <w:pPr>
+        <w:pStyle w:val="FirstParagraph"/>
+      </w:pPr>
+      <w:r>
+        <w:t xml:space="preserve">Increase requests record justification, target workload, SKU/family, region, amount, existing usage, target date, owner, policy version, approval, and before/after values. Requests without sufficient justification are not auto-escalated to Microsoft.</w:t>
+      </w:r>
+      <w:r>
+        <w:t xml:space="preserve"> </w:t>
+      </w:r>
+      <w:r>
+        <w:rPr>
+          <w:rStyle w:val="VerbatimChar"/>
+        </w:rPr>
+        <w:t xml:space="preserve">[Decided]</w:t>
+      </w:r>
+    </w:p>
     <w:bookmarkEnd w:id="27"/>
-    <w:bookmarkStart w:id="28" w:name="consequences"/>
-    <w:p>
-      <w:pPr>
-        <w:pStyle w:val="Heading3"/>
-      </w:pPr>
-      <w:r>
-        <w:t xml:space="preserve">Consequences</w:t>
+    <w:bookmarkStart w:id="28" w:name="readiness-and-alerting-integration"/>
+    <w:p>
+      <w:pPr>
+        <w:pStyle w:val="Heading2"/>
+      </w:pPr>
+      <w:r>
+        <w:t xml:space="preserve">Readiness and Alerting Integration</w:t>
       </w:r>
     </w:p>
     <w:p>
@@ -1095,111 +2112,7 @@
         <w:pStyle w:val="FirstParagraph"/>
       </w:pPr>
       <w:r>
-        <w:rPr>
-          <w:bCs/>
-          <w:b/>
-        </w:rPr>
-        <w:t xml:space="preserve">Positive:</w:t>
-      </w:r>
-      <w:r>
-        <w:t xml:space="preserve"> </w:t>
-      </w:r>
-      <w:r>
-        <w:t xml:space="preserve">- Capacity grows ahead of demand with sufficient lead time for quota approvals — reducing capacity-exhaustion incidents.</w:t>
-      </w:r>
-      <w:r>
-        <w:t xml:space="preserve"> </w:t>
-      </w:r>
-      <w:r>
-        <w:t xml:space="preserve">- The debounce/cooldown and approval gate prevent runaway or thrashing increases.</w:t>
-      </w:r>
-      <w:r>
-        <w:t xml:space="preserve"> </w:t>
-      </w:r>
-      <w:r>
-        <w:t xml:space="preserve">-</w:t>
-      </w:r>
-      <w:r>
-        <w:t xml:space="preserve"> </w:t>
-      </w:r>
-      <w:r>
-        <w:rPr>
-          <w:rStyle w:val="VerbatimChar"/>
-        </w:rPr>
-        <w:t xml:space="preserve">CapacityIncreaseRequest</w:t>
-      </w:r>
-      <w:r>
-        <w:t xml:space="preserve"> </w:t>
-      </w:r>
-      <w:r>
-        <w:t xml:space="preserve">gives a fully auditable, retryable, cancellable growth workflow.</w:t>
-      </w:r>
-      <w:r>
-        <w:t xml:space="preserve"> </w:t>
-      </w:r>
-      <w:r>
-        <w:t xml:space="preserve">- Right-sizing recovers cost from over-reserved CRs without risking allocated VMs.</w:t>
-      </w:r>
-    </w:p>
-    <w:p>
-      <w:pPr>
-        <w:pStyle w:val="BodyText"/>
-      </w:pPr>
-      <w:r>
-        <w:rPr>
-          <w:bCs/>
-          <w:b/>
-        </w:rPr>
-        <w:t xml:space="preserve">Negative / trade-offs:</w:t>
-      </w:r>
-      <w:r>
-        <w:t xml:space="preserve"> </w:t>
-      </w:r>
-      <w:r>
-        <w:t xml:space="preserve">- Approval-gated in Phase 1 means growth is not instantaneous — acceptable because Emergency Transfer (see ADR-003) covers crisis speed.</w:t>
-      </w:r>
-      <w:r>
-        <w:t xml:space="preserve"> </w:t>
-      </w:r>
-      <w:r>
-        <w:t xml:space="preserve">- Forecast accuracy depends on history; workload-tagged per-workload forecasts are only partially covered.</w:t>
-      </w:r>
-      <w:r>
-        <w:t xml:space="preserve"> </w:t>
-      </w:r>
-      <w:r>
-        <w:t xml:space="preserve">- Threshold, buffer, and cooldown values are empirical and require tuning during the pilot; SLA/propagation times are measured, not invented.</w:t>
-      </w:r>
-      <w:r>
-        <w:t xml:space="preserve"> </w:t>
-      </w:r>
-      <w:r>
-        <w:t xml:space="preserve">- the</w:t>
-      </w:r>
-      <w:r>
-        <w:t xml:space="preserve"> </w:t>
-      </w:r>
-      <w:r>
-        <w:rPr>
-          <w:rStyle w:val="VerbatimChar"/>
-        </w:rPr>
-        <w:t xml:space="preserve">CapacityIncreaseRequest</w:t>
-      </w:r>
-      <w:r>
-        <w:t xml:space="preserve"> </w:t>
-      </w:r>
-      <w:r>
-        <w:t xml:space="preserve">lifecycle (entity, approval, retry, cancellation) is still a backlog item requiring an end-to-end approved-increase test.</w:t>
-      </w:r>
-    </w:p>
-    <w:bookmarkEnd w:id="28"/>
-    <w:bookmarkStart w:id="29" w:name="alternatives-considered"/>
-    <w:p>
-      <w:pPr>
-        <w:pStyle w:val="Heading3"/>
-      </w:pPr>
-      <w:r>
-        <w:t xml:space="preserve">Alternatives Considered</w:t>
+        <w:t xml:space="preserve">Reconciliation and forecast output feed the readiness states defined in ADR-001:</w:t>
       </w:r>
     </w:p>
     <w:tbl>
@@ -1224,19 +2137,19 @@
               <w:jc w:val="left"/>
             </w:pPr>
             <w:r>
-              <w:t xml:space="preserve">Alternative</w:t>
-            </w:r>
-          </w:p>
-        </w:tc>
-        <w:tc>
-          <w:tcPr/>
-          <w:p>
-            <w:pPr>
-              <w:pStyle w:val="Compact"/>
-              <w:jc w:val="left"/>
-            </w:pPr>
-            <w:r>
-              <w:t xml:space="preserve">Why Rejected</w:t>
+              <w:t xml:space="preserve">Condition</w:t>
+            </w:r>
+          </w:p>
+        </w:tc>
+        <w:tc>
+          <w:tcPr/>
+          <w:p>
+            <w:pPr>
+              <w:pStyle w:val="Compact"/>
+              <w:jc w:val="left"/>
+            </w:pPr>
+            <w:r>
+              <w:t xml:space="preserve">State or alert</w:t>
             </w:r>
           </w:p>
         </w:tc>
@@ -1250,32 +2163,22 @@
               <w:jc w:val="left"/>
             </w:pPr>
             <w:r>
-              <w:rPr>
-                <w:bCs/>
-                <w:b/>
-              </w:rPr>
-              <w:t xml:space="preserve">Fully autonomous auto-increase</w:t>
-            </w:r>
-          </w:p>
-        </w:tc>
-        <w:tc>
-          <w:tcPr/>
-          <w:p>
-            <w:pPr>
-              <w:pStyle w:val="Compact"/>
-              <w:jc w:val="left"/>
-            </w:pPr>
-            <w:r>
-              <w:t xml:space="preserve">Removes human control over material cost/quota changes; unacceptable in Phase 1.</w:t>
-            </w:r>
-            <w:r>
-              <w:t xml:space="preserve"> </w:t>
-            </w:r>
+              <w:t xml:space="preserve">Snapshot older than max age and refresh fails</w:t>
+            </w:r>
+          </w:p>
+        </w:tc>
+        <w:tc>
+          <w:tcPr/>
+          <w:p>
+            <w:pPr>
+              <w:pStyle w:val="Compact"/>
+              <w:jc w:val="left"/>
+            </w:pPr>
             <w:r>
               <w:rPr>
                 <w:rStyle w:val="VerbatimChar"/>
               </w:rPr>
-              <w:t xml:space="preserve">[Documented]</w:t>
+              <w:t xml:space="preserve">STALE_STATE</w:t>
             </w:r>
           </w:p>
         </w:tc>
@@ -1289,23 +2192,667 @@
               <w:jc w:val="left"/>
             </w:pPr>
             <w:r>
+              <w:t xml:space="preserve">Reservation below target</w:t>
+            </w:r>
+          </w:p>
+        </w:tc>
+        <w:tc>
+          <w:tcPr/>
+          <w:p>
+            <w:pPr>
+              <w:pStyle w:val="Compact"/>
+              <w:jc w:val="left"/>
+            </w:pPr>
+            <w:r>
               <w:rPr>
-                <w:bCs/>
-                <w:b/>
+                <w:rStyle w:val="VerbatimChar"/>
               </w:rPr>
-              <w:t xml:space="preserve">Auto-increase escalating into emergency tiers</w:t>
-            </w:r>
-          </w:p>
-        </w:tc>
-        <w:tc>
-          <w:tcPr/>
-          <w:p>
-            <w:pPr>
-              <w:pStyle w:val="Compact"/>
-              <w:jc w:val="left"/>
-            </w:pPr>
-            <w:r>
-              <w:t xml:space="preserve">Conflates growth with crisis response; could run emergency ops without a DR declaration.</w:t>
+              <w:t xml:space="preserve">RESERVATION_DEFICIT</w:t>
+            </w:r>
+            <w:r>
+              <w:t xml:space="preserve"> </w:t>
+            </w:r>
+            <w:r>
+              <w:t xml:space="preserve">and production/DR buffer alert</w:t>
+            </w:r>
+          </w:p>
+        </w:tc>
+      </w:tr>
+      <w:tr>
+        <w:tc>
+          <w:tcPr/>
+          <w:p>
+            <w:pPr>
+              <w:pStyle w:val="Compact"/>
+              <w:jc w:val="left"/>
+            </w:pPr>
+            <w:r>
+              <w:t xml:space="preserve">Azure cannot raise reservation</w:t>
+            </w:r>
+          </w:p>
+        </w:tc>
+        <w:tc>
+          <w:tcPr/>
+          <w:p>
+            <w:pPr>
+              <w:pStyle w:val="Compact"/>
+              <w:jc w:val="left"/>
+            </w:pPr>
+            <w:r>
+              <w:t xml:space="preserve">Scale-up failure alert and exposed buffer deficit</w:t>
+            </w:r>
+          </w:p>
+        </w:tc>
+      </w:tr>
+      <w:tr>
+        <w:tc>
+          <w:tcPr/>
+          <w:p>
+            <w:pPr>
+              <w:pStyle w:val="Compact"/>
+              <w:jc w:val="left"/>
+            </w:pPr>
+            <w:r>
+              <w:t xml:space="preserve">Consumer quota below deployment requirement</w:t>
+            </w:r>
+          </w:p>
+        </w:tc>
+        <w:tc>
+          <w:tcPr/>
+          <w:p>
+            <w:pPr>
+              <w:pStyle w:val="Compact"/>
+              <w:jc w:val="left"/>
+            </w:pPr>
+            <w:r>
+              <w:rPr>
+                <w:rStyle w:val="VerbatimChar"/>
+              </w:rPr>
+              <w:t xml:space="preserve">QUOTA_DEFICIT</w:t>
+            </w:r>
+          </w:p>
+        </w:tc>
+      </w:tr>
+      <w:tr>
+        <w:tc>
+          <w:tcPr/>
+          <w:p>
+            <w:pPr>
+              <w:pStyle w:val="Compact"/>
+              <w:jc w:val="left"/>
+            </w:pPr>
+            <w:r>
+              <w:t xml:space="preserve">Reservation exists but quota cannot deploy it</w:t>
+            </w:r>
+          </w:p>
+        </w:tc>
+        <w:tc>
+          <w:tcPr/>
+          <w:p>
+            <w:pPr>
+              <w:pStyle w:val="Compact"/>
+              <w:jc w:val="left"/>
+            </w:pPr>
+            <w:r>
+              <w:rPr>
+                <w:rStyle w:val="VerbatimChar"/>
+              </w:rPr>
+              <w:t xml:space="preserve">READY_WITH_RISK</w:t>
+            </w:r>
+            <w:r>
+              <w:t xml:space="preserve"> </w:t>
+            </w:r>
+            <w:r>
+              <w:t xml:space="preserve">or</w:t>
+            </w:r>
+            <w:r>
+              <w:t xml:space="preserve"> </w:t>
+            </w:r>
+            <w:r>
+              <w:rPr>
+                <w:rStyle w:val="VerbatimChar"/>
+              </w:rPr>
+              <w:t xml:space="preserve">QUOTA_DEFICIT</w:t>
+            </w:r>
+            <w:r>
+              <w:t xml:space="preserve"> </w:t>
+            </w:r>
+            <w:r>
+              <w:t xml:space="preserve">by policy</w:t>
+            </w:r>
+          </w:p>
+        </w:tc>
+      </w:tr>
+      <w:tr>
+        <w:tc>
+          <w:tcPr/>
+          <w:p>
+            <w:pPr>
+              <w:pStyle w:val="Compact"/>
+              <w:jc w:val="left"/>
+            </w:pPr>
+            <w:r>
+              <w:t xml:space="preserve">Policy exception required</w:t>
+            </w:r>
+          </w:p>
+        </w:tc>
+        <w:tc>
+          <w:tcPr/>
+          <w:p>
+            <w:pPr>
+              <w:pStyle w:val="Compact"/>
+              <w:jc w:val="left"/>
+            </w:pPr>
+            <w:r>
+              <w:rPr>
+                <w:rStyle w:val="VerbatimChar"/>
+              </w:rPr>
+              <w:t xml:space="preserve">POLICY_BLOCKED</w:t>
+            </w:r>
+          </w:p>
+        </w:tc>
+      </w:tr>
+      <w:tr>
+        <w:tc>
+          <w:tcPr/>
+          <w:p>
+            <w:pPr>
+              <w:pStyle w:val="Compact"/>
+              <w:jc w:val="left"/>
+            </w:pPr>
+            <w:r>
+              <w:t xml:space="preserve">Unknown Azure/preview behavior</w:t>
+            </w:r>
+          </w:p>
+        </w:tc>
+        <w:tc>
+          <w:tcPr/>
+          <w:p>
+            <w:pPr>
+              <w:pStyle w:val="Compact"/>
+              <w:jc w:val="left"/>
+            </w:pPr>
+            <w:r>
+              <w:rPr>
+                <w:rStyle w:val="VerbatimChar"/>
+              </w:rPr>
+              <w:t xml:space="preserve">VALIDATION_REQUIRED</w:t>
+            </w:r>
+          </w:p>
+        </w:tc>
+      </w:tr>
+      <w:tr>
+        <w:tc>
+          <w:tcPr/>
+          <w:p>
+            <w:pPr>
+              <w:pStyle w:val="Compact"/>
+              <w:jc w:val="left"/>
+            </w:pPr>
+            <w:r>
+              <w:t xml:space="preserve">Sustained zero allocation with cost</w:t>
+            </w:r>
+          </w:p>
+        </w:tc>
+        <w:tc>
+          <w:tcPr/>
+          <w:p>
+            <w:pPr>
+              <w:pStyle w:val="Compact"/>
+              <w:jc w:val="left"/>
+            </w:pPr>
+            <w:r>
+              <w:t xml:space="preserve">Idle reservation cost alert</w:t>
+            </w:r>
+          </w:p>
+        </w:tc>
+      </w:tr>
+    </w:tbl>
+    <w:p>
+      <w:pPr>
+        <w:pStyle w:val="BodyText"/>
+      </w:pPr>
+      <w:r>
+        <w:t xml:space="preserve">Core metrics include reserved quantity, allocated count, associated count, available reserved capacity, configured buffer, buffer deficit/surplus, quota assigned/used/available, pooled quota, reservation utilization, unused reservation cost, reconciliation success/failure, throttling/latency, state age, and deployment blocks.</w:t>
+      </w:r>
+      <w:r>
+        <w:t xml:space="preserve"> </w:t>
+      </w:r>
+      <w:r>
+        <w:rPr>
+          <w:rStyle w:val="VerbatimChar"/>
+        </w:rPr>
+        <w:t xml:space="preserve">[Decided]</w:t>
+      </w:r>
+    </w:p>
+    <w:bookmarkEnd w:id="28"/>
+    <w:bookmarkStart w:id="29" w:name="scale-down-and-cost-policy"/>
+    <w:p>
+      <w:pPr>
+        <w:pStyle w:val="Heading2"/>
+      </w:pPr>
+      <w:r>
+        <w:t xml:space="preserve">Scale-Down and Cost Policy</w:t>
+      </w:r>
+    </w:p>
+    <w:p>
+      <w:pPr>
+        <w:pStyle w:val="FirstParagraph"/>
+      </w:pPr>
+      <w:r>
+        <w:t xml:space="preserve">Scale-down is cost-positive but risk-sensitive:</w:t>
+      </w:r>
+    </w:p>
+    <w:p>
+      <w:pPr>
+        <w:numPr>
+          <w:ilvl w:val="0"/>
+          <w:numId w:val="1007"/>
+        </w:numPr>
+        <w:pStyle w:val="Compact"/>
+      </w:pPr>
+      <w:r>
+        <w:t xml:space="preserve">never reduce below allocated demand plus protected buffer;</w:t>
+      </w:r>
+    </w:p>
+    <w:p>
+      <w:pPr>
+        <w:numPr>
+          <w:ilvl w:val="0"/>
+          <w:numId w:val="1007"/>
+        </w:numPr>
+        <w:pStyle w:val="Compact"/>
+      </w:pPr>
+      <w:r>
+        <w:t xml:space="preserve">do not treat associated-but-deallocated VMs as allocated, but report restart risk;</w:t>
+      </w:r>
+    </w:p>
+    <w:p>
+      <w:pPr>
+        <w:numPr>
+          <w:ilvl w:val="0"/>
+          <w:numId w:val="1007"/>
+        </w:numPr>
+        <w:pStyle w:val="Compact"/>
+      </w:pPr>
+      <w:r>
+        <w:t xml:space="preserve">respect DR protection and CVAL earmarks from ADR-003;</w:t>
+      </w:r>
+    </w:p>
+    <w:p>
+      <w:pPr>
+        <w:numPr>
+          <w:ilvl w:val="0"/>
+          <w:numId w:val="1007"/>
+        </w:numPr>
+        <w:pStyle w:val="Compact"/>
+      </w:pPr>
+      <w:r>
+        <w:t xml:space="preserve">honor active maintenance windows and manual overrides;</w:t>
+      </w:r>
+    </w:p>
+    <w:p>
+      <w:pPr>
+        <w:numPr>
+          <w:ilvl w:val="0"/>
+          <w:numId w:val="1007"/>
+        </w:numPr>
+        <w:pStyle w:val="Compact"/>
+      </w:pPr>
+      <w:r>
+        <w:t xml:space="preserve">apply minimum-hold intervals to avoid thrashing;</w:t>
+      </w:r>
+    </w:p>
+    <w:p>
+      <w:pPr>
+        <w:numPr>
+          <w:ilvl w:val="0"/>
+          <w:numId w:val="1007"/>
+        </w:numPr>
+        <w:pStyle w:val="Compact"/>
+      </w:pPr>
+      <w:r>
+        <w:t xml:space="preserve">reduce unused reservations to zero where allowed instead of deleting them;</w:t>
+      </w:r>
+    </w:p>
+    <w:p>
+      <w:pPr>
+        <w:numPr>
+          <w:ilvl w:val="0"/>
+          <w:numId w:val="1007"/>
+        </w:numPr>
+        <w:pStyle w:val="Compact"/>
+      </w:pPr>
+      <w:r>
+        <w:t xml:space="preserve">require separate approval for deletion/decommissioning.</w:t>
+      </w:r>
+      <w:r>
+        <w:t xml:space="preserve"> </w:t>
+      </w:r>
+      <w:r>
+        <w:rPr>
+          <w:rStyle w:val="VerbatimChar"/>
+        </w:rPr>
+        <w:t xml:space="preserve">[Decided]</w:t>
+      </w:r>
+    </w:p>
+    <w:bookmarkEnd w:id="29"/>
+    <w:bookmarkStart w:id="30" w:name="api-and-operational-controls"/>
+    <w:p>
+      <w:pPr>
+        <w:pStyle w:val="Heading2"/>
+      </w:pPr>
+      <w:r>
+        <w:t xml:space="preserve">API and Operational Controls</w:t>
+      </w:r>
+    </w:p>
+    <w:p>
+      <w:pPr>
+        <w:pStyle w:val="FirstParagraph"/>
+      </w:pPr>
+      <w:r>
+        <w:t xml:space="preserve">All mutating operations return an operation resource rather than implying synchronous completion. Mutations require idempotency key, caller identity, expected state version, policy version, dry-run support for high-impact changes, structured precondition failures, and an operation polling URL.</w:t>
+      </w:r>
+      <w:r>
+        <w:t xml:space="preserve"> </w:t>
+      </w:r>
+      <w:r>
+        <w:rPr>
+          <w:rStyle w:val="VerbatimChar"/>
+        </w:rPr>
+        <w:t xml:space="preserve">[Decided]</w:t>
+      </w:r>
+    </w:p>
+    <w:p>
+      <w:pPr>
+        <w:pStyle w:val="BodyText"/>
+      </w:pPr>
+      <w:r>
+        <w:t xml:space="preserve">Operators can pause mutation while retaining inventory and alerting. Manual overrides must include owner, reason, desired value, expiry, and audit metadata; reconciliation must not overwrite an active approved override.</w:t>
+      </w:r>
+      <w:r>
+        <w:t xml:space="preserve"> </w:t>
+      </w:r>
+      <w:r>
+        <w:rPr>
+          <w:rStyle w:val="VerbatimChar"/>
+        </w:rPr>
+        <w:t xml:space="preserve">[Decided]</w:t>
+      </w:r>
+    </w:p>
+    <w:bookmarkEnd w:id="30"/>
+    <w:bookmarkStart w:id="31" w:name="consequences"/>
+    <w:p>
+      <w:pPr>
+        <w:pStyle w:val="Heading2"/>
+      </w:pPr>
+      <w:r>
+        <w:t xml:space="preserve">Consequences</w:t>
+      </w:r>
+    </w:p>
+    <w:p>
+      <w:pPr>
+        <w:pStyle w:val="FirstParagraph"/>
+      </w:pPr>
+      <w:r>
+        <w:rPr>
+          <w:bCs/>
+          <w:b/>
+        </w:rPr>
+        <w:t xml:space="preserve">Positive</w:t>
+      </w:r>
+    </w:p>
+    <w:p>
+      <w:pPr>
+        <w:numPr>
+          <w:ilvl w:val="0"/>
+          <w:numId w:val="1008"/>
+        </w:numPr>
+        <w:pStyle w:val="Compact"/>
+      </w:pPr>
+      <w:r>
+        <w:t xml:space="preserve">Aligns reservation cost with actual allocated demand while preserving configurable buffers.</w:t>
+      </w:r>
+      <w:r>
+        <w:t xml:space="preserve"> </w:t>
+      </w:r>
+      <w:r>
+        <w:rPr>
+          <w:rStyle w:val="VerbatimChar"/>
+        </w:rPr>
+        <w:t xml:space="preserve">[Decided]</w:t>
+      </w:r>
+    </w:p>
+    <w:p>
+      <w:pPr>
+        <w:numPr>
+          <w:ilvl w:val="0"/>
+          <w:numId w:val="1008"/>
+        </w:numPr>
+        <w:pStyle w:val="Compact"/>
+      </w:pPr>
+      <w:r>
+        <w:t xml:space="preserve">Prevents non-paying or deliberately deallocated associated VMs from silently driving paid reservation retention.</w:t>
+      </w:r>
+      <w:r>
+        <w:t xml:space="preserve"> </w:t>
+      </w:r>
+      <w:r>
+        <w:rPr>
+          <w:rStyle w:val="VerbatimChar"/>
+        </w:rPr>
+        <w:t xml:space="preserve">[Derived]</w:t>
+      </w:r>
+    </w:p>
+    <w:p>
+      <w:pPr>
+        <w:numPr>
+          <w:ilvl w:val="0"/>
+          <w:numId w:val="1008"/>
+        </w:numPr>
+        <w:pStyle w:val="Compact"/>
+      </w:pPr>
+      <w:r>
+        <w:t xml:space="preserve">Keeps forecast planning useful without making it a destructive automation path.</w:t>
+      </w:r>
+      <w:r>
+        <w:t xml:space="preserve"> </w:t>
+      </w:r>
+      <w:r>
+        <w:rPr>
+          <w:rStyle w:val="VerbatimChar"/>
+        </w:rPr>
+        <w:t xml:space="preserve">[Decided]</w:t>
+      </w:r>
+    </w:p>
+    <w:p>
+      <w:pPr>
+        <w:numPr>
+          <w:ilvl w:val="0"/>
+          <w:numId w:val="1008"/>
+        </w:numPr>
+        <w:pStyle w:val="Compact"/>
+      </w:pPr>
+      <w:r>
+        <w:t xml:space="preserve">Produces clear AEP/provisioning readiness states and operational alerts.</w:t>
+      </w:r>
+      <w:r>
+        <w:t xml:space="preserve"> </w:t>
+      </w:r>
+      <w:r>
+        <w:rPr>
+          <w:rStyle w:val="VerbatimChar"/>
+        </w:rPr>
+        <w:t xml:space="preserve">[Decided]</w:t>
+      </w:r>
+    </w:p>
+    <w:p>
+      <w:pPr>
+        <w:pStyle w:val="FirstParagraph"/>
+      </w:pPr>
+      <w:r>
+        <w:rPr>
+          <w:bCs/>
+          <w:b/>
+        </w:rPr>
+        <w:t xml:space="preserve">Negative / trade-offs</w:t>
+      </w:r>
+    </w:p>
+    <w:p>
+      <w:pPr>
+        <w:numPr>
+          <w:ilvl w:val="0"/>
+          <w:numId w:val="1009"/>
+        </w:numPr>
+        <w:pStyle w:val="Compact"/>
+      </w:pPr>
+      <w:r>
+        <w:t xml:space="preserve">Reductions require richer policy checks and may be slower than simple right-sizing.</w:t>
+      </w:r>
+      <w:r>
+        <w:t xml:space="preserve"> </w:t>
+      </w:r>
+      <w:r>
+        <w:rPr>
+          <w:rStyle w:val="VerbatimChar"/>
+        </w:rPr>
+        <w:t xml:space="preserve">[Derived]</w:t>
+      </w:r>
+    </w:p>
+    <w:p>
+      <w:pPr>
+        <w:numPr>
+          <w:ilvl w:val="0"/>
+          <w:numId w:val="1009"/>
+        </w:numPr>
+        <w:pStyle w:val="Compact"/>
+      </w:pPr>
+      <w:r>
+        <w:t xml:space="preserve">Forecast recommendations remain advisory until accuracy and false-positive rates are measured.</w:t>
+      </w:r>
+      <w:r>
+        <w:t xml:space="preserve"> </w:t>
+      </w:r>
+      <w:r>
+        <w:rPr>
+          <w:rStyle w:val="VerbatimChar"/>
+        </w:rPr>
+        <w:t xml:space="preserve">[Assumed]</w:t>
+      </w:r>
+    </w:p>
+    <w:p>
+      <w:pPr>
+        <w:numPr>
+          <w:ilvl w:val="0"/>
+          <w:numId w:val="1009"/>
+        </w:numPr>
+        <w:pStyle w:val="Compact"/>
+      </w:pPr>
+      <w:r>
+        <w:t xml:space="preserve">Six-minute reference reconciliation must be tuned at scale to avoid API storms.</w:t>
+      </w:r>
+      <w:r>
+        <w:t xml:space="preserve"> </w:t>
+      </w:r>
+      <w:r>
+        <w:rPr>
+          <w:rStyle w:val="VerbatimChar"/>
+        </w:rPr>
+        <w:t xml:space="preserve">[Assumed]</w:t>
+      </w:r>
+    </w:p>
+    <w:p>
+      <w:pPr>
+        <w:numPr>
+          <w:ilvl w:val="0"/>
+          <w:numId w:val="1009"/>
+        </w:numPr>
+        <w:pStyle w:val="Compact"/>
+      </w:pPr>
+      <w:r>
+        <w:t xml:space="preserve">Zero-capacity behavior must be validated per Azure scenario before broad production dependency.</w:t>
+      </w:r>
+      <w:r>
+        <w:t xml:space="preserve"> </w:t>
+      </w:r>
+      <w:r>
+        <w:rPr>
+          <w:rStyle w:val="VerbatimChar"/>
+        </w:rPr>
+        <w:t xml:space="preserve">[Assumed]</w:t>
+      </w:r>
+    </w:p>
+    <w:bookmarkEnd w:id="31"/>
+    <w:bookmarkStart w:id="32" w:name="alternatives-considered"/>
+    <w:p>
+      <w:pPr>
+        <w:pStyle w:val="Heading2"/>
+      </w:pPr>
+      <w:r>
+        <w:t xml:space="preserve">Alternatives Considered</w:t>
+      </w:r>
+    </w:p>
+    <w:tbl>
+      <w:tblPr>
+        <w:tblStyle w:val="Table"/>
+        <w:tblW w:type="pct" w:w="5000"/>
+        <w:tblLook w:firstRow="1" w:lastRow="0" w:firstColumn="0" w:lastColumn="0" w:noHBand="0" w:noVBand="0" w:val="0020"/>
+      </w:tblPr>
+      <w:tblGrid>
+        <w:gridCol w:w="3960"/>
+        <w:gridCol w:w="3960"/>
+      </w:tblGrid>
+      <w:tr>
+        <w:trPr>
+          <w:tblHeader w:val="true"/>
+        </w:trPr>
+        <w:tc>
+          <w:tcPr/>
+          <w:p>
+            <w:pPr>
+              <w:pStyle w:val="Compact"/>
+              <w:jc w:val="left"/>
+            </w:pPr>
+            <w:r>
+              <w:t xml:space="preserve">Alternative</w:t>
+            </w:r>
+          </w:p>
+        </w:tc>
+        <w:tc>
+          <w:tcPr/>
+          <w:p>
+            <w:pPr>
+              <w:pStyle w:val="Compact"/>
+              <w:jc w:val="left"/>
+            </w:pPr>
+            <w:r>
+              <w:t xml:space="preserve">Disposition</w:t>
+            </w:r>
+          </w:p>
+        </w:tc>
+      </w:tr>
+      <w:tr>
+        <w:tc>
+          <w:tcPr/>
+          <w:p>
+            <w:pPr>
+              <w:pStyle w:val="Compact"/>
+              <w:jc w:val="left"/>
+            </w:pPr>
+            <w:r>
+              <w:t xml:space="preserve">Forecast formula as the continuous floor</w:t>
+            </w:r>
+          </w:p>
+        </w:tc>
+        <w:tc>
+          <w:tcPr/>
+          <w:p>
+            <w:pPr>
+              <w:pStyle w:val="Compact"/>
+              <w:jc w:val="left"/>
+            </w:pPr>
+            <w:r>
+              <w:t xml:space="preserve">Rejected; continuous floor is allocated demand plus buffer.</w:t>
             </w:r>
             <w:r>
               <w:t xml:space="preserve"> </w:t>
@@ -1328,23 +2875,19 @@
               <w:jc w:val="left"/>
             </w:pPr>
             <w:r>
-              <w:rPr>
-                <w:bCs/>
-                <w:b/>
-              </w:rPr>
-              <w:t xml:space="preserve">Fixed-timer cooldown</w:t>
-            </w:r>
-          </w:p>
-        </w:tc>
-        <w:tc>
-          <w:tcPr/>
-          <w:p>
-            <w:pPr>
-              <w:pStyle w:val="Compact"/>
-              <w:jc w:val="left"/>
-            </w:pPr>
-            <w:r>
-              <w:t xml:space="preserve">Less adaptive than recovering the budget incrementally using observed success rates.</w:t>
+              <w:t xml:space="preserve">Preserve reservations for all associated VMs</w:t>
+            </w:r>
+          </w:p>
+        </w:tc>
+        <w:tc>
+          <w:tcPr/>
+          <w:p>
+            <w:pPr>
+              <w:pStyle w:val="Compact"/>
+              <w:jc w:val="left"/>
+            </w:pPr>
+            <w:r>
+              <w:t xml:space="preserve">Rejected as too costly unless explicitly required by policy.</w:t>
             </w:r>
             <w:r>
               <w:t xml:space="preserve"> </w:t>
@@ -1353,7 +2896,7 @@
               <w:rPr>
                 <w:rStyle w:val="VerbatimChar"/>
               </w:rPr>
-              <w:t xml:space="preserve">[Assumed]</w:t>
+              <w:t xml:space="preserve">[Decided]</w:t>
             </w:r>
           </w:p>
         </w:tc>
@@ -1367,23 +2910,19 @@
               <w:jc w:val="left"/>
             </w:pPr>
             <w:r>
-              <w:rPr>
-                <w:bCs/>
-                <w:b/>
-              </w:rPr>
-              <w:t xml:space="preserve">No lead-time alerting (react on exhaustion)</w:t>
-            </w:r>
-          </w:p>
-        </w:tc>
-        <w:tc>
-          <w:tcPr/>
-          <w:p>
-            <w:pPr>
-              <w:pStyle w:val="Compact"/>
-              <w:jc w:val="left"/>
-            </w:pPr>
-            <w:r>
-              <w:t xml:space="preserve">Quota approvals take too long; reacting at exhaustion guarantees deployment failures.</w:t>
+              <w:t xml:space="preserve">Automatic deletion of unused reservations</w:t>
+            </w:r>
+          </w:p>
+        </w:tc>
+        <w:tc>
+          <w:tcPr/>
+          <w:p>
+            <w:pPr>
+              <w:pStyle w:val="Compact"/>
+              <w:jc w:val="left"/>
+            </w:pPr>
+            <w:r>
+              <w:t xml:space="preserve">Rejected; set to zero where possible and use separate decommissioning workflow.</w:t>
             </w:r>
             <w:r>
               <w:t xml:space="preserve"> </w:t>
@@ -1392,7 +2931,7 @@
               <w:rPr>
                 <w:rStyle w:val="VerbatimChar"/>
               </w:rPr>
-              <w:t xml:space="preserve">[Documented]</w:t>
+              <w:t xml:space="preserve">[Decided]</w:t>
             </w:r>
           </w:p>
         </w:tc>
@@ -1406,23 +2945,19 @@
               <w:jc w:val="left"/>
             </w:pPr>
             <w:r>
-              <w:rPr>
-                <w:bCs/>
-                <w:b/>
-              </w:rPr>
-              <w:t xml:space="preserve">Sizing without a DR buffer</w:t>
-            </w:r>
-          </w:p>
-        </w:tc>
-        <w:tc>
-          <w:tcPr/>
-          <w:p>
-            <w:pPr>
-              <w:pStyle w:val="Compact"/>
-              <w:jc w:val="left"/>
-            </w:pPr>
-            <w:r>
-              <w:t xml:space="preserve">Under-reserves relative to DR obligations; the formula includes an explicit</w:t>
+              <w:t xml:space="preserve">Fixed five-minute or six-minute production interval</w:t>
+            </w:r>
+          </w:p>
+        </w:tc>
+        <w:tc>
+          <w:tcPr/>
+          <w:p>
+            <w:pPr>
+              <w:pStyle w:val="Compact"/>
+              <w:jc w:val="left"/>
+            </w:pPr>
+            <w:r>
+              <w:t xml:space="preserve">Rejected as a universal guarantee; six minutes is the reference implementation only.</w:t>
             </w:r>
             <w:r>
               <w:t xml:space="preserve"> </w:t>
@@ -1431,13 +2966,33 @@
               <w:rPr>
                 <w:rStyle w:val="VerbatimChar"/>
               </w:rPr>
-              <w:t xml:space="preserve">DR_Buffer</w:t>
-            </w:r>
-            <w:r>
-              <w:t xml:space="preserve"> </w:t>
-            </w:r>
-            <w:r>
-              <w:t xml:space="preserve">term.</w:t>
+              <w:t xml:space="preserve">[Decided]</w:t>
+            </w:r>
+          </w:p>
+        </w:tc>
+      </w:tr>
+      <w:tr>
+        <w:tc>
+          <w:tcPr/>
+          <w:p>
+            <w:pPr>
+              <w:pStyle w:val="Compact"/>
+              <w:jc w:val="left"/>
+            </w:pPr>
+            <w:r>
+              <w:t xml:space="preserve">Silent fallback when Azure cannot supply capacity</w:t>
+            </w:r>
+          </w:p>
+        </w:tc>
+        <w:tc>
+          <w:tcPr/>
+          <w:p>
+            <w:pPr>
+              <w:pStyle w:val="Compact"/>
+              <w:jc w:val="left"/>
+            </w:pPr>
+            <w:r>
+              <w:t xml:space="preserve">Rejected; alert and expose the deficit.</w:t>
             </w:r>
             <w:r>
               <w:t xml:space="preserve"> </w:t>
@@ -1446,7 +3001,7 @@
               <w:rPr>
                 <w:rStyle w:val="VerbatimChar"/>
               </w:rPr>
-              <w:t xml:space="preserve">[Documented]</w:t>
+              <w:t xml:space="preserve">[Decided]</w:t>
             </w:r>
           </w:p>
         </w:tc>
@@ -1459,21 +3014,14 @@
         </w:pict>
       </w:r>
     </w:p>
-    <w:p>
-      <w:r>
-        <w:pict>
-          <v:rect style="width:0;height:1.5pt" o:hralign="center" o:hrstd="t" o:hr="t"/>
-        </w:pict>
-      </w:r>
-    </w:p>
-    <w:bookmarkEnd w:id="29"/>
-    <w:bookmarkStart w:id="30" w:name="appendix-adr-summary"/>
+    <w:bookmarkEnd w:id="32"/>
+    <w:bookmarkStart w:id="33" w:name="appendix---adr-summary"/>
     <w:p>
       <w:pPr>
         <w:pStyle w:val="Heading2"/>
       </w:pPr>
       <w:r>
-        <w:t xml:space="preserve">Appendix — ADR Summary</w:t>
+        <w:t xml:space="preserve">Appendix - ADR Summary</w:t>
       </w:r>
     </w:p>
     <w:tbl>
@@ -1511,7 +3059,7 @@
               <w:jc w:val="left"/>
             </w:pPr>
             <w:r>
-              <w:t xml:space="preserve">Hard Constraints Applied</w:t>
+              <w:t xml:space="preserve">Requirements Applied</w:t>
             </w:r>
           </w:p>
         </w:tc>
@@ -1537,59 +3085,57 @@
               <w:jc w:val="left"/>
             </w:pPr>
             <w:r>
-              <w:t xml:space="preserve">ADR-004 Forecast &amp; Increase</w:t>
-            </w:r>
-          </w:p>
-        </w:tc>
-        <w:tc>
-          <w:tcPr/>
-          <w:p>
-            <w:pPr>
-              <w:pStyle w:val="Compact"/>
-              <w:jc w:val="left"/>
-            </w:pPr>
-            <w:r>
-              <w:t xml:space="preserve">HC-3 (at execution)</w:t>
-            </w:r>
-          </w:p>
-        </w:tc>
-        <w:tc>
-          <w:tcPr/>
-          <w:p>
-            <w:pPr>
-              <w:pStyle w:val="Compact"/>
-              <w:jc w:val="left"/>
-            </w:pPr>
-            <w:r>
-              <w:t xml:space="preserve">Workload-tagged forecasts;</w:t>
+              <w:t xml:space="preserve">ADR-004 Forecast, Reconciliation, and Increase</w:t>
+            </w:r>
+          </w:p>
+        </w:tc>
+        <w:tc>
+          <w:tcPr/>
+          <w:p>
+            <w:pPr>
+              <w:pStyle w:val="Compact"/>
+              <w:jc w:val="left"/>
+            </w:pPr>
+            <w:r>
+              <w:t xml:space="preserve">CAP-003..010,</w:t>
             </w:r>
             <w:r>
               <w:t xml:space="preserve"> </w:t>
             </w:r>
             <w:r>
               <w:rPr>
-                <w:rStyle w:val="VerbatimChar"/>
+                <w:bCs/>
+                <w:b/>
               </w:rPr>
-              <w:t xml:space="preserve">CapacityIncreaseRequest</w:t>
-            </w:r>
-            <w:r>
-              <w:t xml:space="preserve"> </w:t>
-            </w:r>
-            <w:r>
-              <w:t xml:space="preserve">lifecycle end-to-end test</w:t>
+              <w:t xml:space="preserve">CAP-019, CAP-020..024</w:t>
+            </w:r>
+            <w:r>
+              <w:t xml:space="preserve">, QUA-006..010, RDY-001..004, OBS-001..005, OPS-001..006</w:t>
+            </w:r>
+          </w:p>
+        </w:tc>
+        <w:tc>
+          <w:tcPr/>
+          <w:p>
+            <w:pPr>
+              <w:pStyle w:val="Compact"/>
+              <w:jc w:val="left"/>
+            </w:pPr>
+            <w:r>
+              <w:t xml:space="preserve">POC-004 throttling, POC-005 allocation states, POC-008/009 buffer policies, POC-010 production interval; seed-matrix budget-governance workflow and reactive-discovery governance SLA to be validated in first reconciliation dry-run</w:t>
             </w:r>
           </w:p>
         </w:tc>
       </w:tr>
     </w:tbl>
-    <w:bookmarkEnd w:id="30"/>
-    <w:bookmarkStart w:id="31" w:name="appendix-status-legend"/>
+    <w:bookmarkEnd w:id="33"/>
+    <w:bookmarkStart w:id="34" w:name="appendix---status-legend"/>
     <w:p>
       <w:pPr>
         <w:pStyle w:val="Heading2"/>
       </w:pPr>
       <w:r>
-        <w:t xml:space="preserve">Appendix — Status Legend</w:t>
+        <w:t xml:space="preserve">Appendix - Status Legend</w:t>
       </w:r>
     </w:p>
     <w:tbl>
@@ -1752,14 +3298,14 @@
         </w:tc>
       </w:tr>
     </w:tbl>
-    <w:bookmarkEnd w:id="31"/>
-    <w:bookmarkStart w:id="32" w:name="appendix-evidence-tag-taxonomy"/>
+    <w:bookmarkEnd w:id="34"/>
+    <w:bookmarkStart w:id="35" w:name="appendix---evidence-tag-taxonomy"/>
     <w:p>
       <w:pPr>
         <w:pStyle w:val="Heading2"/>
       </w:pPr>
       <w:r>
-        <w:t xml:space="preserve">Appendix — Evidence Tag Taxonomy</w:t>
+        <w:t xml:space="preserve">Appendix - Evidence Tag Taxonomy</w:t>
       </w:r>
     </w:p>
     <w:tbl>
@@ -1918,8 +3464,8 @@
         </w:tc>
       </w:tr>
     </w:tbl>
-    <w:bookmarkEnd w:id="32"/>
-    <w:bookmarkStart w:id="33" w:name="related-adrs"/>
+    <w:bookmarkEnd w:id="35"/>
+    <w:bookmarkStart w:id="36" w:name="related-adrs"/>
     <w:p>
       <w:pPr>
         <w:pStyle w:val="Heading2"/>
@@ -1932,7 +3478,7 @@
       <w:pPr>
         <w:numPr>
           <w:ilvl w:val="0"/>
-          <w:numId w:val="1003"/>
+          <w:numId w:val="1010"/>
         </w:numPr>
         <w:pStyle w:val="Compact"/>
       </w:pPr>
@@ -1941,7 +3487,7 @@
           <w:bCs/>
           <w:b/>
         </w:rPr>
-        <w:t xml:space="preserve">ADR-001 — Region Selection</w:t>
+        <w:t xml:space="preserve">ADR-001 - Region Selection and Customer Placement</w:t>
       </w:r>
       <w:r>
         <w:t xml:space="preserve"> </w:t>
@@ -1963,7 +3509,7 @@
       <w:pPr>
         <w:numPr>
           <w:ilvl w:val="0"/>
-          <w:numId w:val="1003"/>
+          <w:numId w:val="1010"/>
         </w:numPr>
         <w:pStyle w:val="Compact"/>
       </w:pPr>
@@ -1972,7 +3518,7 @@
           <w:bCs/>
           <w:b/>
         </w:rPr>
-        <w:t xml:space="preserve">ADR-002 — Quota and Capacity Management</w:t>
+        <w:t xml:space="preserve">ADR-002 - Quota and Capacity Management</w:t>
       </w:r>
       <w:r>
         <w:t xml:space="preserve"> </w:t>
@@ -1994,7 +3540,7 @@
       <w:pPr>
         <w:numPr>
           <w:ilvl w:val="0"/>
-          <w:numId w:val="1003"/>
+          <w:numId w:val="1010"/>
         </w:numPr>
         <w:pStyle w:val="Compact"/>
       </w:pPr>
@@ -2003,7 +3549,7 @@
           <w:bCs/>
           <w:b/>
         </w:rPr>
-        <w:t xml:space="preserve">ADR-003 — Capacity Management during Disaster Recovery (DR)</w:t>
+        <w:t xml:space="preserve">ADR-003 - Capacity Management during Disaster Recovery (DR)</w:t>
       </w:r>
       <w:r>
         <w:t xml:space="preserve"> </w:t>
@@ -2059,11 +3605,11 @@
         <w:t xml:space="preserve"> </w:t>
       </w:r>
       <w:r>
-        <w:t xml:space="preserve">After proof-of-concept validation of Azure Quota Groups GA and quota-release latency, and on resolution of the consumer-credential model and engine-mode state-machine items.</w:t>
-      </w:r>
-    </w:p>
-    <w:bookmarkEnd w:id="33"/>
-    <w:bookmarkEnd w:id="34"/>
+        <w:t xml:space="preserve">After POC-004, POC-005, POC-008, POC-009, POC-010, and first reconciliation dry-run against production-like scope.</w:t>
+      </w:r>
+    </w:p>
+    <w:bookmarkEnd w:id="36"/>
+    <w:bookmarkEnd w:id="37"/>
     <w:sectPr/>
   </w:body>
 </w:document>
@@ -2170,6 +3716,82 @@
       </w:pPr>
     </w:lvl>
   </w:abstractNum>
+  <w:abstractNum w:abstractNumId="991">
+    <w:nsid w:val="A991"/>
+    <w:multiLevelType w:val="multilevel"/>
+    <w:lvl w:ilvl="0">
+      <w:numFmt w:val="bullet"/>
+      <w:lvlText w:val="•"/>
+      <w:lvlJc w:val="left"/>
+      <w:pPr>
+        <w:ind w:left="720" w:hanging="480"/>
+      </w:pPr>
+    </w:lvl>
+    <w:lvl w:ilvl="1">
+      <w:numFmt w:val="bullet"/>
+      <w:lvlText w:val="–"/>
+      <w:lvlJc w:val="left"/>
+      <w:pPr>
+        <w:ind w:left="1440" w:hanging="480"/>
+      </w:pPr>
+    </w:lvl>
+    <w:lvl w:ilvl="2">
+      <w:numFmt w:val="bullet"/>
+      <w:lvlText w:val="•"/>
+      <w:lvlJc w:val="left"/>
+      <w:pPr>
+        <w:ind w:left="2160" w:hanging="480"/>
+      </w:pPr>
+    </w:lvl>
+    <w:lvl w:ilvl="3">
+      <w:numFmt w:val="bullet"/>
+      <w:lvlText w:val="–"/>
+      <w:lvlJc w:val="left"/>
+      <w:pPr>
+        <w:ind w:left="2880" w:hanging="480"/>
+      </w:pPr>
+    </w:lvl>
+    <w:lvl w:ilvl="4">
+      <w:numFmt w:val="bullet"/>
+      <w:lvlText w:val="•"/>
+      <w:lvlJc w:val="left"/>
+      <w:pPr>
+        <w:ind w:left="3600" w:hanging="480"/>
+      </w:pPr>
+    </w:lvl>
+    <w:lvl w:ilvl="5">
+      <w:numFmt w:val="bullet"/>
+      <w:lvlText w:val="–"/>
+      <w:lvlJc w:val="left"/>
+      <w:pPr>
+        <w:ind w:left="4320" w:hanging="480"/>
+      </w:pPr>
+    </w:lvl>
+    <w:lvl w:ilvl="6">
+      <w:numFmt w:val="bullet"/>
+      <w:lvlText w:val="•"/>
+      <w:lvlJc w:val="left"/>
+      <w:pPr>
+        <w:ind w:left="5040" w:hanging="480"/>
+      </w:pPr>
+    </w:lvl>
+    <w:lvl w:ilvl="7">
+      <w:numFmt w:val="bullet"/>
+      <w:lvlText w:val="–"/>
+      <w:lvlJc w:val="left"/>
+      <w:pPr>
+        <w:ind w:left="5760" w:hanging="480"/>
+      </w:pPr>
+    </w:lvl>
+    <w:lvl w:ilvl="8">
+      <w:numFmt w:val="bullet"/>
+      <w:lvlText w:val="•"/>
+      <w:lvlJc w:val="left"/>
+      <w:pPr>
+        <w:ind w:left="6480" w:hanging="480"/>
+      </w:pPr>
+    </w:lvl>
+  </w:abstractNum>
   <w:abstractNum w:abstractNumId="99411">
     <w:nsid w:val="A99411"/>
     <w:multiLevelType w:val="multilevel"/>
@@ -2255,114 +3877,11 @@
       </w:pPr>
     </w:lvl>
   </w:abstractNum>
-  <w:abstractNum w:abstractNumId="991">
-    <w:nsid w:val="A991"/>
-    <w:multiLevelType w:val="multilevel"/>
-    <w:lvl w:ilvl="0">
-      <w:numFmt w:val="bullet"/>
-      <w:lvlText w:val="•"/>
-      <w:lvlJc w:val="left"/>
-      <w:pPr>
-        <w:ind w:left="720" w:hanging="480"/>
-      </w:pPr>
-    </w:lvl>
-    <w:lvl w:ilvl="1">
-      <w:numFmt w:val="bullet"/>
-      <w:lvlText w:val="–"/>
-      <w:lvlJc w:val="left"/>
-      <w:pPr>
-        <w:ind w:left="1440" w:hanging="480"/>
-      </w:pPr>
-    </w:lvl>
-    <w:lvl w:ilvl="2">
-      <w:numFmt w:val="bullet"/>
-      <w:lvlText w:val="•"/>
-      <w:lvlJc w:val="left"/>
-      <w:pPr>
-        <w:ind w:left="2160" w:hanging="480"/>
-      </w:pPr>
-    </w:lvl>
-    <w:lvl w:ilvl="3">
-      <w:numFmt w:val="bullet"/>
-      <w:lvlText w:val="–"/>
-      <w:lvlJc w:val="left"/>
-      <w:pPr>
-        <w:ind w:left="2880" w:hanging="480"/>
-      </w:pPr>
-    </w:lvl>
-    <w:lvl w:ilvl="4">
-      <w:numFmt w:val="bullet"/>
-      <w:lvlText w:val="•"/>
-      <w:lvlJc w:val="left"/>
-      <w:pPr>
-        <w:ind w:left="3600" w:hanging="480"/>
-      </w:pPr>
-    </w:lvl>
-    <w:lvl w:ilvl="5">
-      <w:numFmt w:val="bullet"/>
-      <w:lvlText w:val="–"/>
-      <w:lvlJc w:val="left"/>
-      <w:pPr>
-        <w:ind w:left="4320" w:hanging="480"/>
-      </w:pPr>
-    </w:lvl>
-    <w:lvl w:ilvl="6">
-      <w:numFmt w:val="bullet"/>
-      <w:lvlText w:val="•"/>
-      <w:lvlJc w:val="left"/>
-      <w:pPr>
-        <w:ind w:left="5040" w:hanging="480"/>
-      </w:pPr>
-    </w:lvl>
-    <w:lvl w:ilvl="7">
-      <w:numFmt w:val="bullet"/>
-      <w:lvlText w:val="–"/>
-      <w:lvlJc w:val="left"/>
-      <w:pPr>
-        <w:ind w:left="5760" w:hanging="480"/>
-      </w:pPr>
-    </w:lvl>
-    <w:lvl w:ilvl="8">
-      <w:numFmt w:val="bullet"/>
-      <w:lvlText w:val="•"/>
-      <w:lvlJc w:val="left"/>
-      <w:pPr>
-        <w:ind w:left="6480" w:hanging="480"/>
-      </w:pPr>
-    </w:lvl>
-  </w:abstractNum>
   <w:num w:numId="1000">
     <w:abstractNumId w:val="990"/>
   </w:num>
   <w:num w:numId="1001">
-    <w:abstractNumId w:val="99411"/>
-    <w:lvlOverride w:ilvl="0">
-      <w:startOverride w:val="1"/>
-    </w:lvlOverride>
-    <w:lvlOverride w:ilvl="1">
-      <w:startOverride w:val="1"/>
-    </w:lvlOverride>
-    <w:lvlOverride w:ilvl="2">
-      <w:startOverride w:val="1"/>
-    </w:lvlOverride>
-    <w:lvlOverride w:ilvl="3">
-      <w:startOverride w:val="1"/>
-    </w:lvlOverride>
-    <w:lvlOverride w:ilvl="4">
-      <w:startOverride w:val="1"/>
-    </w:lvlOverride>
-    <w:lvlOverride w:ilvl="5">
-      <w:startOverride w:val="1"/>
-    </w:lvlOverride>
-    <w:lvlOverride w:ilvl="6">
-      <w:startOverride w:val="1"/>
-    </w:lvlOverride>
-    <w:lvlOverride w:ilvl="7">
-      <w:startOverride w:val="1"/>
-    </w:lvlOverride>
-    <w:lvlOverride w:ilvl="8">
-      <w:startOverride w:val="1"/>
-    </w:lvlOverride>
+    <w:abstractNumId w:val="991"/>
   </w:num>
   <w:num w:numId="1002">
     <w:abstractNumId w:val="99411"/>
@@ -2395,6 +3914,81 @@
     </w:lvlOverride>
   </w:num>
   <w:num w:numId="1003">
+    <w:abstractNumId w:val="991"/>
+  </w:num>
+  <w:num w:numId="1004">
+    <w:abstractNumId w:val="99411"/>
+    <w:lvlOverride w:ilvl="0">
+      <w:startOverride w:val="1"/>
+    </w:lvlOverride>
+    <w:lvlOverride w:ilvl="1">
+      <w:startOverride w:val="1"/>
+    </w:lvlOverride>
+    <w:lvlOverride w:ilvl="2">
+      <w:startOverride w:val="1"/>
+    </w:lvlOverride>
+    <w:lvlOverride w:ilvl="3">
+      <w:startOverride w:val="1"/>
+    </w:lvlOverride>
+    <w:lvlOverride w:ilvl="4">
+      <w:startOverride w:val="1"/>
+    </w:lvlOverride>
+    <w:lvlOverride w:ilvl="5">
+      <w:startOverride w:val="1"/>
+    </w:lvlOverride>
+    <w:lvlOverride w:ilvl="6">
+      <w:startOverride w:val="1"/>
+    </w:lvlOverride>
+    <w:lvlOverride w:ilvl="7">
+      <w:startOverride w:val="1"/>
+    </w:lvlOverride>
+    <w:lvlOverride w:ilvl="8">
+      <w:startOverride w:val="1"/>
+    </w:lvlOverride>
+  </w:num>
+  <w:num w:numId="1005">
+    <w:abstractNumId w:val="99411"/>
+    <w:lvlOverride w:ilvl="0">
+      <w:startOverride w:val="1"/>
+    </w:lvlOverride>
+    <w:lvlOverride w:ilvl="1">
+      <w:startOverride w:val="1"/>
+    </w:lvlOverride>
+    <w:lvlOverride w:ilvl="2">
+      <w:startOverride w:val="1"/>
+    </w:lvlOverride>
+    <w:lvlOverride w:ilvl="3">
+      <w:startOverride w:val="1"/>
+    </w:lvlOverride>
+    <w:lvlOverride w:ilvl="4">
+      <w:startOverride w:val="1"/>
+    </w:lvlOverride>
+    <w:lvlOverride w:ilvl="5">
+      <w:startOverride w:val="1"/>
+    </w:lvlOverride>
+    <w:lvlOverride w:ilvl="6">
+      <w:startOverride w:val="1"/>
+    </w:lvlOverride>
+    <w:lvlOverride w:ilvl="7">
+      <w:startOverride w:val="1"/>
+    </w:lvlOverride>
+    <w:lvlOverride w:ilvl="8">
+      <w:startOverride w:val="1"/>
+    </w:lvlOverride>
+  </w:num>
+  <w:num w:numId="1006">
+    <w:abstractNumId w:val="991"/>
+  </w:num>
+  <w:num w:numId="1007">
+    <w:abstractNumId w:val="991"/>
+  </w:num>
+  <w:num w:numId="1008">
+    <w:abstractNumId w:val="991"/>
+  </w:num>
+  <w:num w:numId="1009">
+    <w:abstractNumId w:val="991"/>
+  </w:num>
+  <w:num w:numId="1010">
     <w:abstractNumId w:val="991"/>
   </w:num>
 </w:numbering>

</xml_diff>